<commit_message>
rapport final et readme.md
</commit_message>
<xml_diff>
--- a/doc/Rapport.docx
+++ b/doc/Rapport.docx
@@ -1,6 +1,6 @@
 
 <file path=word/document.xml><?xml version="1.0" encoding="utf-8"?>
-<w:document xmlns:wpc="http://schemas.microsoft.com/office/word/2010/wordprocessingCanvas" xmlns:cx="http://schemas.microsoft.com/office/drawing/2014/chartex" xmlns:cx1="http://schemas.microsoft.com/office/drawing/2015/9/8/chartex" xmlns:cx2="http://schemas.microsoft.com/office/drawing/2015/10/21/chartex" xmlns:cx3="http://schemas.microsoft.com/office/drawing/2016/5/9/chartex" xmlns:cx4="http://schemas.microsoft.com/office/drawing/2016/5/10/chartex" xmlns:cx5="http://schemas.microsoft.com/office/drawing/2016/5/11/chartex" xmlns:cx6="http://schemas.microsoft.com/office/drawing/2016/5/12/chartex" xmlns:cx7="http://schemas.microsoft.com/office/drawing/2016/5/13/chartex" xmlns:cx8="http://schemas.microsoft.com/office/drawing/2016/5/14/chartex" xmlns:mc="http://schemas.openxmlformats.org/markup-compatibility/2006" xmlns:aink="http://schemas.microsoft.com/office/drawing/2016/ink" xmlns:am3d="http://schemas.microsoft.com/office/drawing/2017/model3d" xmlns:o="urn:schemas-microsoft-com:office:office" xmlns:oel="http://schemas.microsoft.com/office/2019/extlst" xmlns:r="http://schemas.openxmlformats.org/officeDocument/2006/relationships" xmlns:m="http://schemas.openxmlformats.org/officeDocument/2006/math" xmlns:v="urn:schemas-microsoft-com:vml" xmlns:wp14="http://schemas.microsoft.com/office/word/2010/wordprocessingDrawing" xmlns:wp="http://schemas.openxmlformats.org/drawingml/2006/wordprocessingDrawing" xmlns:w10="urn:schemas-microsoft-com:office:word" xmlns:w="http://schemas.openxmlformats.org/wordprocessingml/2006/main" xmlns:w14="http://schemas.microsoft.com/office/word/2010/wordml" xmlns:w15="http://schemas.microsoft.com/office/word/2012/wordml" xmlns:w16cex="http://schemas.microsoft.com/office/word/2018/wordml/cex" xmlns:w16cid="http://schemas.microsoft.com/office/word/2016/wordml/cid" xmlns:w16="http://schemas.microsoft.com/office/word/2018/wordml" xmlns:w16du="http://schemas.microsoft.com/office/word/2023/wordml/word16du" xmlns:w16sdtdh="http://schemas.microsoft.com/office/word/2020/wordml/sdtdatahash" xmlns:w16sdtfl="http://schemas.microsoft.com/office/word/2024/wordml/sdtformatlock" xmlns:w16se="http://schemas.microsoft.com/office/word/2015/wordml/symex" xmlns:wpg="http://schemas.microsoft.com/office/word/2010/wordprocessingGroup" xmlns:wpi="http://schemas.microsoft.com/office/word/2010/wordprocessingInk" xmlns:wne="http://schemas.microsoft.com/office/word/2006/wordml" xmlns:wps="http://schemas.microsoft.com/office/word/2010/wordprocessingShape" xmlns:a="http://schemas.openxmlformats.org/drawingml/2006/main" xmlns:pic="http://schemas.openxmlformats.org/drawingml/2006/picture" xmlns:a14="http://schemas.microsoft.com/office/drawing/2010/main" mc:Ignorable="w14 w15 w16se w16cid w16 w16cex w16sdtdh w16sdtfl w16du wp14">
+<w:document xmlns:wpc="http://schemas.microsoft.com/office/word/2010/wordprocessingCanvas" xmlns:cx="http://schemas.microsoft.com/office/drawing/2014/chartex" xmlns:cx1="http://schemas.microsoft.com/office/drawing/2015/9/8/chartex" xmlns:cx2="http://schemas.microsoft.com/office/drawing/2015/10/21/chartex" xmlns:cx3="http://schemas.microsoft.com/office/drawing/2016/5/9/chartex" xmlns:cx4="http://schemas.microsoft.com/office/drawing/2016/5/10/chartex" xmlns:cx5="http://schemas.microsoft.com/office/drawing/2016/5/11/chartex" xmlns:cx6="http://schemas.microsoft.com/office/drawing/2016/5/12/chartex" xmlns:cx7="http://schemas.microsoft.com/office/drawing/2016/5/13/chartex" xmlns:cx8="http://schemas.microsoft.com/office/drawing/2016/5/14/chartex" xmlns:mc="http://schemas.openxmlformats.org/markup-compatibility/2006" xmlns:aink="http://schemas.microsoft.com/office/drawing/2016/ink" xmlns:am3d="http://schemas.microsoft.com/office/drawing/2017/model3d" xmlns:o="urn:schemas-microsoft-com:office:office" xmlns:oel="http://schemas.microsoft.com/office/2019/extlst" xmlns:r="http://schemas.openxmlformats.org/officeDocument/2006/relationships" xmlns:m="http://schemas.openxmlformats.org/officeDocument/2006/math" xmlns:v="urn:schemas-microsoft-com:vml" xmlns:wp14="http://schemas.microsoft.com/office/word/2010/wordprocessingDrawing" xmlns:wp="http://schemas.openxmlformats.org/drawingml/2006/wordprocessingDrawing" xmlns:w10="urn:schemas-microsoft-com:office:word" xmlns:w="http://schemas.openxmlformats.org/wordprocessingml/2006/main" xmlns:w14="http://schemas.microsoft.com/office/word/2010/wordml" xmlns:w15="http://schemas.microsoft.com/office/word/2012/wordml" xmlns:w16cex="http://schemas.microsoft.com/office/word/2018/wordml/cex" xmlns:w16cid="http://schemas.microsoft.com/office/word/2016/wordml/cid" xmlns:w16="http://schemas.microsoft.com/office/word/2018/wordml" xmlns:w16du="http://schemas.microsoft.com/office/word/2023/wordml/word16du" xmlns:w16sdtdh="http://schemas.microsoft.com/office/word/2020/wordml/sdtdatahash" xmlns:w16sdtfl="http://schemas.microsoft.com/office/word/2024/wordml/sdtformatlock" xmlns:w16se="http://schemas.microsoft.com/office/word/2015/wordml/symex" xmlns:wpg="http://schemas.microsoft.com/office/word/2010/wordprocessingGroup" xmlns:wpi="http://schemas.microsoft.com/office/word/2010/wordprocessingInk" xmlns:wne="http://schemas.microsoft.com/office/word/2006/wordml" xmlns:wps="http://schemas.microsoft.com/office/word/2010/wordprocessingShape" mc:Ignorable="w14 w15 w16se w16cid w16 w16cex w16sdtdh w16sdtfl w16du wp14">
   <w:body>
     <w:p>
       <w:pPr>
@@ -38,14 +38,7 @@
           <w:sz w:val="20"/>
           <w:szCs w:val="20"/>
         </w:rPr>
-        <w:t>navigateur web</w:t>
-      </w:r>
-      <w:r>
-        <w:rPr>
-          <w:sz w:val="20"/>
-          <w:szCs w:val="20"/>
-        </w:rPr>
-        <w:t xml:space="preserve"> avec une interface HTML/CSS et une implémentation complète des règles du jeu.</w:t>
+        <w:t>navigateur web avec une interface HTML/CSS et une implémentation complète des règles du jeu.</w:t>
       </w:r>
       <w:r>
         <w:br/>
@@ -120,35 +113,17 @@
           <w:sz w:val="20"/>
           <w:szCs w:val="20"/>
         </w:rPr>
-        <w:t xml:space="preserve">, nous avons choisi de développer une version simplifiée de </w:t>
-      </w:r>
-      <w:r>
-        <w:rPr>
-          <w:b w:val="0"/>
-          <w:bCs w:val="0"/>
-          <w:sz w:val="20"/>
-          <w:szCs w:val="20"/>
-        </w:rPr>
-        <w:t>Pac</w:t>
+        <w:t>, nous avons choisi de développer une version simplifiée de Pac</w:t>
       </w:r>
       <w:r>
         <w:noBreakHyphen/>
       </w:r>
       <w:r>
         <w:rPr>
-          <w:b w:val="0"/>
-          <w:bCs w:val="0"/>
-          <w:sz w:val="20"/>
-          <w:szCs w:val="20"/>
-        </w:rPr>
-        <w:t>Man</w:t>
-      </w:r>
-      <w:r>
-        <w:rPr>
-          <w:sz w:val="20"/>
-          <w:szCs w:val="20"/>
-        </w:rPr>
-        <w:t xml:space="preserve"> : un jeu de course dans un labyrinthe avec un ou plusieurs fantômes</w:t>
+          <w:sz w:val="20"/>
+          <w:szCs w:val="20"/>
+        </w:rPr>
+        <w:t>Man : un jeu de course dans un labyrinthe avec un ou plusieurs fantômes</w:t>
       </w:r>
       <w:r>
         <w:rPr>
@@ -218,23 +193,7 @@
           <w:sz w:val="20"/>
           <w:szCs w:val="20"/>
         </w:rPr>
-        <w:t xml:space="preserve">ons également prévu soit une limite de temps, soit des points à manger. Finalement, nous avons retenu le système de </w:t>
-      </w:r>
-      <w:r>
-        <w:rPr>
-          <w:b w:val="0"/>
-          <w:bCs w:val="0"/>
-          <w:sz w:val="20"/>
-          <w:szCs w:val="20"/>
-        </w:rPr>
-        <w:t>pastilles</w:t>
-      </w:r>
-      <w:r>
-        <w:rPr>
-          <w:sz w:val="20"/>
-          <w:szCs w:val="20"/>
-        </w:rPr>
-        <w:t xml:space="preserve"> qui donnent des points au joueur.</w:t>
+        <w:t>ons également prévu soit une limite de temps, soit des points à manger. Finalement, nous avons retenu le système de pastilles qui donnent des points au joueur.</w:t>
       </w:r>
     </w:p>
     <w:p>
@@ -328,14 +287,7 @@
           <w:sz w:val="20"/>
           <w:szCs w:val="20"/>
         </w:rPr>
-        <w:t xml:space="preserve"> </w:t>
-      </w:r>
-      <w:r>
-        <w:rPr>
-          <w:sz w:val="20"/>
-          <w:szCs w:val="20"/>
-        </w:rPr>
-        <w:t>Pac</w:t>
+        <w:t xml:space="preserve"> Pac</w:t>
       </w:r>
       <w:r>
         <w:noBreakHyphen/>
@@ -345,14 +297,7 @@
           <w:sz w:val="20"/>
           <w:szCs w:val="20"/>
         </w:rPr>
-        <w:t>Man</w:t>
-      </w:r>
-      <w:r>
-        <w:rPr>
-          <w:sz w:val="20"/>
-          <w:szCs w:val="20"/>
-        </w:rPr>
-        <w:t xml:space="preserve"> dans un labyrinthe ;</w:t>
+        <w:t>Man dans un labyrinthe ;</w:t>
       </w:r>
     </w:p>
     <w:p>
@@ -494,23 +439,7 @@
           <w:sz w:val="20"/>
           <w:szCs w:val="20"/>
         </w:rPr>
-        <w:t xml:space="preserve">Man se déplace dans un labyrinthe à l’aide des </w:t>
-      </w:r>
-      <w:r>
-        <w:rPr>
-          <w:b w:val="0"/>
-          <w:bCs w:val="0"/>
-          <w:sz w:val="20"/>
-          <w:szCs w:val="20"/>
-        </w:rPr>
-        <w:t>flèches du clavier</w:t>
-      </w:r>
-      <w:r>
-        <w:rPr>
-          <w:sz w:val="20"/>
-          <w:szCs w:val="20"/>
-        </w:rPr>
-        <w:t xml:space="preserve"> (haut, bas, gauche, droite)</w:t>
+        <w:t>Man se déplace dans un labyrinthe à l’aide des flèches du clavier (haut, bas, gauche, droite)</w:t>
       </w:r>
     </w:p>
     <w:p>
@@ -539,23 +468,7 @@
           <w:sz w:val="20"/>
           <w:szCs w:val="20"/>
         </w:rPr>
-        <w:t xml:space="preserve"> pastille mangée augmente le score de </w:t>
-      </w:r>
-      <w:r>
-        <w:rPr>
-          <w:b w:val="0"/>
-          <w:bCs w:val="0"/>
-          <w:sz w:val="20"/>
-          <w:szCs w:val="20"/>
-        </w:rPr>
-        <w:t>10 points</w:t>
-      </w:r>
-      <w:r>
-        <w:rPr>
-          <w:sz w:val="20"/>
-          <w:szCs w:val="20"/>
-        </w:rPr>
-        <w:t xml:space="preserve"> ;</w:t>
+        <w:t xml:space="preserve"> pastille mangée augmente le score de 10 points ;</w:t>
       </w:r>
     </w:p>
     <w:p>
@@ -584,23 +497,7 @@
           <w:sz w:val="20"/>
           <w:szCs w:val="20"/>
         </w:rPr>
-        <w:t xml:space="preserve"> toutes les pastilles de la carte sont mangées, la partie est </w:t>
-      </w:r>
-      <w:r>
-        <w:rPr>
-          <w:b w:val="0"/>
-          <w:bCs w:val="0"/>
-          <w:sz w:val="20"/>
-          <w:szCs w:val="20"/>
-        </w:rPr>
-        <w:t>gagnée</w:t>
-      </w:r>
-      <w:r>
-        <w:rPr>
-          <w:sz w:val="20"/>
-          <w:szCs w:val="20"/>
-        </w:rPr>
-        <w:t xml:space="preserve"> ;</w:t>
+        <w:t xml:space="preserve"> toutes les pastilles de la carte sont mangées, la partie est gagnée ;</w:t>
       </w:r>
     </w:p>
     <w:p>
@@ -637,23 +534,7 @@
           <w:sz w:val="20"/>
           <w:szCs w:val="20"/>
         </w:rPr>
-        <w:t xml:space="preserve">Man, la partie est </w:t>
-      </w:r>
-      <w:r>
-        <w:rPr>
-          <w:b w:val="0"/>
-          <w:bCs w:val="0"/>
-          <w:sz w:val="20"/>
-          <w:szCs w:val="20"/>
-        </w:rPr>
-        <w:t>perdue</w:t>
-      </w:r>
-      <w:r>
-        <w:rPr>
-          <w:sz w:val="20"/>
-          <w:szCs w:val="20"/>
-        </w:rPr>
-        <w:t>.</w:t>
+        <w:t>Man, la partie est perdue.</w:t>
       </w:r>
     </w:p>
     <w:p>
@@ -722,37 +603,7 @@
           <w:sz w:val="20"/>
           <w:szCs w:val="20"/>
         </w:rPr>
-        <w:t xml:space="preserve"> une page </w:t>
-      </w:r>
-      <w:r>
-        <w:rPr>
-          <w:b w:val="0"/>
-          <w:bCs w:val="0"/>
-          <w:sz w:val="20"/>
-          <w:szCs w:val="20"/>
-        </w:rPr>
-        <w:t>HTML</w:t>
-      </w:r>
-      <w:r>
-        <w:rPr>
-          <w:sz w:val="20"/>
-          <w:szCs w:val="20"/>
-        </w:rPr>
-        <w:t xml:space="preserve"> avec une zone de jeu (</w:t>
-      </w:r>
-      <w:r>
-        <w:rPr>
-          <w:sz w:val="20"/>
-          <w:szCs w:val="20"/>
-        </w:rPr>
-        <w:t>canvas</w:t>
-      </w:r>
-      <w:r>
-        <w:rPr>
-          <w:sz w:val="20"/>
-          <w:szCs w:val="20"/>
-        </w:rPr>
-        <w:t>) et des boutons ;</w:t>
+        <w:t xml:space="preserve"> une page HTML avec une zone de jeu (canvas) et des boutons ;</w:t>
       </w:r>
     </w:p>
     <w:p>
@@ -780,23 +631,7 @@
           <w:sz w:val="20"/>
           <w:szCs w:val="20"/>
         </w:rPr>
-        <w:t xml:space="preserve"> une feuille de style </w:t>
-      </w:r>
-      <w:r>
-        <w:rPr>
-          <w:b w:val="0"/>
-          <w:bCs w:val="0"/>
-          <w:sz w:val="20"/>
-          <w:szCs w:val="20"/>
-        </w:rPr>
-        <w:t>CSS</w:t>
-      </w:r>
-      <w:r>
-        <w:rPr>
-          <w:sz w:val="20"/>
-          <w:szCs w:val="20"/>
-        </w:rPr>
-        <w:t xml:space="preserve"> pour la mise en forme ;</w:t>
+        <w:t xml:space="preserve"> une feuille de style CSS pour la mise en forme ;</w:t>
       </w:r>
     </w:p>
     <w:p>
@@ -824,23 +659,7 @@
           <w:sz w:val="20"/>
           <w:szCs w:val="20"/>
         </w:rPr>
-        <w:t xml:space="preserve"> toute la logique du jeu en </w:t>
-      </w:r>
-      <w:r>
-        <w:rPr>
-          <w:b w:val="0"/>
-          <w:bCs w:val="0"/>
-          <w:sz w:val="20"/>
-          <w:szCs w:val="20"/>
-        </w:rPr>
-        <w:t>JavaScript</w:t>
-      </w:r>
-      <w:r>
-        <w:rPr>
-          <w:sz w:val="20"/>
-          <w:szCs w:val="20"/>
-        </w:rPr>
-        <w:t>.</w:t>
+        <w:t xml:space="preserve"> toute la logique du jeu en JavaScript.</w:t>
       </w:r>
     </w:p>
     <w:p>
@@ -854,10 +673,94 @@
     </w:p>
     <w:p>
       <w:pPr>
+        <w:rPr>
+          <w:sz w:val="20"/>
+          <w:szCs w:val="20"/>
+        </w:rPr>
+      </w:pPr>
+      <w:r>
+        <w:rPr>
+          <w:sz w:val="20"/>
+          <w:szCs w:val="20"/>
+        </w:rPr>
+        <w:t>Le manuel d’utilisation est accessible dans le fichier «</w:t>
+      </w:r>
+      <w:r>
+        <w:rPr>
+          <w:rFonts w:ascii="Arial" w:hAnsi="Arial" w:cs="Arial"/>
+          <w:sz w:val="20"/>
+          <w:szCs w:val="20"/>
+        </w:rPr>
+        <w:t> </w:t>
+      </w:r>
+      <w:r>
+        <w:rPr>
+          <w:sz w:val="20"/>
+          <w:szCs w:val="20"/>
+        </w:rPr>
+        <w:t>README.md</w:t>
+      </w:r>
+      <w:r>
+        <w:rPr>
+          <w:rFonts w:ascii="Arial" w:hAnsi="Arial" w:cs="Arial"/>
+          <w:sz w:val="20"/>
+          <w:szCs w:val="20"/>
+        </w:rPr>
+        <w:t> </w:t>
+      </w:r>
+      <w:r>
+        <w:rPr>
+          <w:rFonts w:ascii="Aptos" w:hAnsi="Aptos" w:cs="Aptos"/>
+          <w:sz w:val="20"/>
+          <w:szCs w:val="20"/>
+        </w:rPr>
+        <w:t>»</w:t>
+      </w:r>
+      <w:r>
+        <w:rPr>
+          <w:rFonts w:ascii="Aptos" w:hAnsi="Aptos" w:cs="Aptos"/>
+          <w:sz w:val="20"/>
+          <w:szCs w:val="20"/>
+        </w:rPr>
+        <w:t xml:space="preserve"> présent</w:t>
+      </w:r>
+      <w:r>
+        <w:rPr>
+          <w:sz w:val="20"/>
+          <w:szCs w:val="20"/>
+        </w:rPr>
+        <w:t xml:space="preserve"> </w:t>
+      </w:r>
+      <w:r>
+        <w:rPr>
+          <w:rFonts w:ascii="Aptos" w:hAnsi="Aptos" w:cs="Aptos"/>
+          <w:sz w:val="20"/>
+          <w:szCs w:val="20"/>
+        </w:rPr>
+        <w:t>à</w:t>
+      </w:r>
+      <w:r>
+        <w:rPr>
+          <w:sz w:val="20"/>
+          <w:szCs w:val="20"/>
+        </w:rPr>
+        <w:t xml:space="preserve"> la racine du projet.</w:t>
+      </w:r>
+      <w:r>
+        <w:rPr>
+          <w:sz w:val="20"/>
+          <w:szCs w:val="20"/>
+        </w:rPr>
+        <w:t xml:space="preserve"> </w:t>
+      </w:r>
+    </w:p>
+    <w:p>
+      <w:pPr>
         <w:pStyle w:val="Titre2"/>
         <w:jc w:val="both"/>
       </w:pPr>
       <w:r>
+        <w:lastRenderedPageBreak/>
         <w:t>Organisation des fichiers</w:t>
       </w:r>
     </w:p>
@@ -893,8 +796,6 @@
       </w:pPr>
       <w:r>
         <w:rPr>
-          <w:b w:val="0"/>
-          <w:bCs w:val="0"/>
           <w:sz w:val="20"/>
           <w:szCs w:val="20"/>
           <w:u w:val="single"/>
@@ -906,21 +807,7 @@
           <w:sz w:val="20"/>
           <w:szCs w:val="20"/>
         </w:rPr>
-        <w:t xml:space="preserve"> : page principale du jeu, contenant le </w:t>
-      </w:r>
-      <w:r>
-        <w:rPr>
-          <w:sz w:val="20"/>
-          <w:szCs w:val="20"/>
-        </w:rPr>
-        <w:t>canvas</w:t>
-      </w:r>
-      <w:r>
-        <w:rPr>
-          <w:sz w:val="20"/>
-          <w:szCs w:val="20"/>
-        </w:rPr>
-        <w:t>, les boutons (Commencer, Recommencer, choix de carte, choix de niveau) et l</w:t>
+        <w:t xml:space="preserve"> : page principale du jeu, contenant le canvas, les boutons (Commencer, Recommencer, choix de carte, choix de niveau) et l</w:t>
       </w:r>
       <w:r>
         <w:rPr>
@@ -953,8 +840,6 @@
       </w:pPr>
       <w:r>
         <w:rPr>
-          <w:b w:val="0"/>
-          <w:bCs w:val="0"/>
           <w:sz w:val="20"/>
           <w:szCs w:val="20"/>
           <w:u w:val="single"/>
@@ -966,21 +851,7 @@
           <w:sz w:val="20"/>
           <w:szCs w:val="20"/>
         </w:rPr>
-        <w:t xml:space="preserve"> : mise en forme de la page, du </w:t>
-      </w:r>
-      <w:r>
-        <w:rPr>
-          <w:sz w:val="20"/>
-          <w:szCs w:val="20"/>
-        </w:rPr>
-        <w:t>canvas</w:t>
-      </w:r>
-      <w:r>
-        <w:rPr>
-          <w:sz w:val="20"/>
-          <w:szCs w:val="20"/>
-        </w:rPr>
-        <w:t>, des boutons et du message de fin de partie</w:t>
+        <w:t xml:space="preserve"> : mise en forme de la page, du canvas, des boutons et du message de fin de partie</w:t>
       </w:r>
     </w:p>
     <w:p>
@@ -999,23 +870,11 @@
       </w:pPr>
       <w:r>
         <w:rPr>
-          <w:b w:val="0"/>
-          <w:bCs w:val="0"/>
           <w:sz w:val="20"/>
           <w:szCs w:val="20"/>
           <w:u w:val="single"/>
         </w:rPr>
-        <w:t>pacman.js</w:t>
-      </w:r>
-      <w:r>
-        <w:rPr>
-          <w:b w:val="0"/>
-          <w:bCs w:val="0"/>
-          <w:sz w:val="20"/>
-          <w:szCs w:val="20"/>
-          <w:u w:val="single"/>
-        </w:rPr>
-        <w:t xml:space="preserve"> </w:t>
+        <w:t xml:space="preserve">pacman.js </w:t>
       </w:r>
       <w:r>
         <w:rPr>
@@ -1056,20 +915,18 @@
           <w:szCs w:val="20"/>
         </w:rPr>
       </w:pPr>
-      <w:r>
-        <w:rPr>
-          <w:b w:val="0"/>
-          <w:bCs w:val="0"/>
+      <w:proofErr w:type="gramStart"/>
+      <w:r>
+        <w:rPr>
           <w:sz w:val="20"/>
           <w:szCs w:val="20"/>
           <w:u w:val="single"/>
         </w:rPr>
         <w:t>images</w:t>
       </w:r>
-      <w:r>
-        <w:rPr>
-          <w:b w:val="0"/>
-          <w:bCs w:val="0"/>
+      <w:proofErr w:type="gramEnd"/>
+      <w:r>
+        <w:rPr>
           <w:sz w:val="20"/>
           <w:szCs w:val="20"/>
           <w:u w:val="single"/>
@@ -1088,21 +945,7 @@
           <w:sz w:val="20"/>
           <w:szCs w:val="20"/>
         </w:rPr>
-        <w:t xml:space="preserve">les </w:t>
-      </w:r>
-      <w:r>
-        <w:rPr>
-          <w:sz w:val="20"/>
-          <w:szCs w:val="20"/>
-        </w:rPr>
-        <w:t>sprites</w:t>
-      </w:r>
-      <w:r>
-        <w:rPr>
-          <w:sz w:val="20"/>
-          <w:szCs w:val="20"/>
-        </w:rPr>
-        <w:t xml:space="preserve"> de Pac-Man (</w:t>
+        <w:t>les sprites de Pac-Man (</w:t>
       </w:r>
       <w:r>
         <w:rPr>
@@ -1163,27 +1006,11 @@
       </w:pPr>
       <w:r>
         <w:rPr>
-          <w:b w:val="0"/>
-          <w:bCs w:val="0"/>
-          <w:i w:val="0"/>
-          <w:iCs w:val="0"/>
           <w:sz w:val="20"/>
           <w:szCs w:val="20"/>
           <w:u w:val="single"/>
         </w:rPr>
-        <w:t>pacman.mp3</w:t>
-      </w:r>
-      <w:r>
-        <w:rPr>
-          <w:b w:val="0"/>
-          <w:bCs w:val="0"/>
-          <w:i w:val="0"/>
-          <w:iCs w:val="0"/>
-          <w:sz w:val="20"/>
-          <w:szCs w:val="20"/>
-          <w:u w:val="single"/>
-        </w:rPr>
-        <w:t xml:space="preserve"> </w:t>
+        <w:t xml:space="preserve">pacman.mp3 </w:t>
       </w:r>
       <w:r>
         <w:rPr>
@@ -1208,8 +1035,6 @@
       </w:pPr>
       <w:r>
         <w:rPr>
-          <w:b w:val="0"/>
-          <w:bCs w:val="0"/>
           <w:sz w:val="20"/>
           <w:szCs w:val="20"/>
           <w:u w:val="single"/>
@@ -1581,12 +1406,6 @@
           <w:szCs w:val="20"/>
         </w:rPr>
         <w:noBreakHyphen/>
-      </w:r>
-      <w:r>
-        <w:rPr>
-          <w:sz w:val="20"/>
-          <w:szCs w:val="20"/>
-        </w:rPr>
         <w:t>Man et des fantômes.</w:t>
       </w:r>
     </w:p>
@@ -1615,6 +1434,7 @@
         <w:t xml:space="preserve">Le dessin du jeu est réalisé dans la fonction </w:t>
       </w:r>
       <w:proofErr w:type="spellStart"/>
+      <w:proofErr w:type="gramStart"/>
       <w:r>
         <w:rPr>
           <w:sz w:val="20"/>
@@ -1628,7 +1448,15 @@
           <w:sz w:val="20"/>
           <w:szCs w:val="20"/>
         </w:rPr>
-        <w:t xml:space="preserve">() du fichier pacman.js. Pour chaque case de la carte, le code </w:t>
+        <w:t>(</w:t>
+      </w:r>
+      <w:proofErr w:type="gramEnd"/>
+      <w:r>
+        <w:rPr>
+          <w:sz w:val="20"/>
+          <w:szCs w:val="20"/>
+        </w:rPr>
+        <w:t xml:space="preserve">) du fichier pacman.js. Pour chaque case de la carte, le code </w:t>
       </w:r>
       <w:r>
         <w:rPr>
@@ -1810,9 +1638,9 @@
           <w:noProof/>
         </w:rPr>
         <w:drawing>
-          <wp:inline distT="0" distB="0" distL="0" distR="0" wp14:anchorId="47C246CE" wp14:editId="42869E99">
-            <wp:extent cx="2912030" cy="2609656"/>
-            <wp:effectExtent l="0" t="0" r="3175" b="635"/>
+          <wp:inline distT="0" distB="0" distL="0" distR="0" wp14:anchorId="47C246CE" wp14:editId="7C7B98B6">
+            <wp:extent cx="3384158" cy="3032760"/>
+            <wp:effectExtent l="0" t="0" r="6985" b="0"/>
             <wp:docPr id="1506835869" name="drawing"/>
             <wp:cNvGraphicFramePr>
               <a:graphicFrameLocks xmlns:a="http://schemas.openxmlformats.org/drawingml/2006/main" noChangeAspect="1"/>
@@ -1840,7 +1668,7 @@
                   <pic:spPr bwMode="auto">
                     <a:xfrm>
                       <a:off x="0" y="0"/>
-                      <a:ext cx="2930884" cy="2626552"/>
+                      <a:ext cx="3405087" cy="3051515"/>
                     </a:xfrm>
                     <a:prstGeom prst="rect">
                       <a:avLst/>
@@ -1867,12 +1695,11 @@
         <w:jc w:val="both"/>
       </w:pPr>
       <w:r>
+        <w:lastRenderedPageBreak/>
         <w:t>Déplacements de Pac</w:t>
       </w:r>
       <w:r>
         <w:noBreakHyphen/>
-      </w:r>
-      <w:r>
         <w:t>Man</w:t>
       </w:r>
     </w:p>
@@ -1897,12 +1724,6 @@
           <w:szCs w:val="20"/>
         </w:rPr>
         <w:noBreakHyphen/>
-      </w:r>
-      <w:r>
-        <w:rPr>
-          <w:sz w:val="20"/>
-          <w:szCs w:val="20"/>
-        </w:rPr>
         <w:t>Man sont gérés par les événements clavier</w:t>
       </w:r>
       <w:r>
@@ -1917,7 +1738,23 @@
           <w:sz w:val="20"/>
           <w:szCs w:val="20"/>
         </w:rPr>
-        <w:t xml:space="preserve">La fonction move() calcule ensuite la nouvelle position en fonction de la direction </w:t>
+        <w:t xml:space="preserve">La fonction </w:t>
+      </w:r>
+      <w:proofErr w:type="gramStart"/>
+      <w:r>
+        <w:rPr>
+          <w:sz w:val="20"/>
+          <w:szCs w:val="20"/>
+        </w:rPr>
+        <w:t>move(</w:t>
+      </w:r>
+      <w:proofErr w:type="gramEnd"/>
+      <w:r>
+        <w:rPr>
+          <w:sz w:val="20"/>
+          <w:szCs w:val="20"/>
+        </w:rPr>
+        <w:t xml:space="preserve">) calcule ensuite la nouvelle position en fonction de la direction </w:t>
       </w:r>
       <w:r>
         <w:rPr>
@@ -1939,12 +1776,6 @@
           <w:szCs w:val="20"/>
         </w:rPr>
         <w:noBreakHyphen/>
-      </w:r>
-      <w:r>
-        <w:rPr>
-          <w:sz w:val="20"/>
-          <w:szCs w:val="20"/>
-        </w:rPr>
         <w:t xml:space="preserve">Man avance. Si la case contient une pastille (O), le code ajoute 10 points au score </w:t>
       </w:r>
       <w:r>
@@ -1978,6 +1809,7 @@
         <w:t xml:space="preserve">Le score est mis à jour via la fonction </w:t>
       </w:r>
       <w:proofErr w:type="spellStart"/>
+      <w:proofErr w:type="gramStart"/>
       <w:r>
         <w:rPr>
           <w:sz w:val="20"/>
@@ -1991,7 +1823,15 @@
           <w:sz w:val="20"/>
           <w:szCs w:val="20"/>
         </w:rPr>
-        <w:t>() qui modifie le texte des éléments HTML correspondants.</w:t>
+        <w:t>(</w:t>
+      </w:r>
+      <w:proofErr w:type="gramEnd"/>
+      <w:r>
+        <w:rPr>
+          <w:sz w:val="20"/>
+          <w:szCs w:val="20"/>
+        </w:rPr>
+        <w:t>) qui modifie le texte des éléments HTML correspondants.</w:t>
       </w:r>
     </w:p>
     <w:p>
@@ -2019,6 +1859,7 @@
         <w:t xml:space="preserve">La fonction </w:t>
       </w:r>
       <w:proofErr w:type="spellStart"/>
+      <w:proofErr w:type="gramStart"/>
       <w:r>
         <w:rPr>
           <w:sz w:val="20"/>
@@ -2032,7 +1873,15 @@
           <w:sz w:val="20"/>
           <w:szCs w:val="20"/>
         </w:rPr>
-        <w:t xml:space="preserve">() appelle </w:t>
+        <w:t>(</w:t>
+      </w:r>
+      <w:proofErr w:type="gramEnd"/>
+      <w:r>
+        <w:rPr>
+          <w:sz w:val="20"/>
+          <w:szCs w:val="20"/>
+        </w:rPr>
+        <w:t xml:space="preserve">) appelle </w:t>
       </w:r>
       <w:r>
         <w:rPr>
@@ -2269,14 +2118,7 @@
           <w:sz w:val="20"/>
           <w:szCs w:val="20"/>
         </w:rPr>
-        <w:t>)</w:t>
-      </w:r>
-      <w:r>
-        <w:rPr>
-          <w:sz w:val="20"/>
-          <w:szCs w:val="20"/>
-        </w:rPr>
-        <w:t xml:space="preserve"> qui </w:t>
+        <w:t xml:space="preserve">) qui </w:t>
       </w:r>
       <w:r>
         <w:rPr>
@@ -2369,14 +2211,7 @@
           <w:sz w:val="20"/>
           <w:szCs w:val="20"/>
         </w:rPr>
-        <w:t xml:space="preserve"> le chemin le plus court jusqu’à </w:t>
-      </w:r>
-      <w:r>
-        <w:rPr>
-          <w:sz w:val="20"/>
-          <w:szCs w:val="20"/>
-        </w:rPr>
-        <w:t>Pac</w:t>
+        <w:t xml:space="preserve"> le chemin le plus court jusqu’à Pac</w:t>
       </w:r>
       <w:r>
         <w:noBreakHyphen/>
@@ -2386,14 +2221,7 @@
           <w:sz w:val="20"/>
           <w:szCs w:val="20"/>
         </w:rPr>
-        <w:t>Man</w:t>
-      </w:r>
-      <w:r>
-        <w:rPr>
-          <w:sz w:val="20"/>
-          <w:szCs w:val="20"/>
-        </w:rPr>
-        <w:t xml:space="preserve"> si une solution existe.</w:t>
+        <w:t>Man si une solution existe.</w:t>
       </w:r>
     </w:p>
     <w:p>
@@ -2485,12 +2313,6 @@
           <w:szCs w:val="20"/>
         </w:rPr>
         <w:noBreakHyphen/>
-      </w:r>
-      <w:r>
-        <w:rPr>
-          <w:sz w:val="20"/>
-          <w:szCs w:val="20"/>
-        </w:rPr>
         <w:t>Man.</w:t>
       </w:r>
     </w:p>
@@ -2605,14 +2427,7 @@
           <w:sz w:val="20"/>
           <w:szCs w:val="20"/>
         </w:rPr>
-        <w:t xml:space="preserve"> fantôme atteint </w:t>
-      </w:r>
-      <w:r>
-        <w:rPr>
-          <w:sz w:val="20"/>
-          <w:szCs w:val="20"/>
-        </w:rPr>
-        <w:t>Pac</w:t>
+        <w:t xml:space="preserve"> fantôme atteint Pac</w:t>
       </w:r>
       <w:r>
         <w:noBreakHyphen/>
@@ -2622,14 +2437,7 @@
           <w:sz w:val="20"/>
           <w:szCs w:val="20"/>
         </w:rPr>
-        <w:t>Man</w:t>
-      </w:r>
-      <w:r>
-        <w:rPr>
-          <w:sz w:val="20"/>
-          <w:szCs w:val="20"/>
-        </w:rPr>
-        <w:t xml:space="preserve"> (défaite).</w:t>
+        <w:t>Man (défaite).</w:t>
       </w:r>
     </w:p>
     <w:p>
@@ -2783,6 +2591,7 @@
           <w:sz w:val="20"/>
           <w:szCs w:val="20"/>
         </w:rPr>
+        <w:lastRenderedPageBreak/>
         <w:t xml:space="preserve">« Eugénie devait faire le style de la carte. L’algorithme BFS devait servir pour l’IA du fantôme, qui calculerait le chemin le plus court menant au joueur à chaque déplacement. Elle se chargeait aussi de faire </w:t>
       </w:r>
       <w:r>
@@ -2866,48 +2675,7 @@
           <w:sz w:val="20"/>
           <w:szCs w:val="20"/>
         </w:rPr>
-        <w:t xml:space="preserve">Nous avons utilisé </w:t>
-      </w:r>
-      <w:r>
-        <w:rPr>
-          <w:b w:val="0"/>
-          <w:bCs w:val="0"/>
-          <w:sz w:val="20"/>
-          <w:szCs w:val="20"/>
-        </w:rPr>
-        <w:t>GitHub</w:t>
-      </w:r>
-      <w:r>
-        <w:rPr>
-          <w:b w:val="0"/>
-          <w:bCs w:val="0"/>
-          <w:sz w:val="20"/>
-          <w:szCs w:val="20"/>
-        </w:rPr>
-        <w:t xml:space="preserve"> </w:t>
-      </w:r>
-      <w:r>
-        <w:rPr>
-          <w:sz w:val="20"/>
-          <w:szCs w:val="20"/>
-        </w:rPr>
-        <w:t xml:space="preserve">pour partager le code et </w:t>
-      </w:r>
-      <w:r>
-        <w:rPr>
-          <w:b w:val="0"/>
-          <w:bCs w:val="0"/>
-          <w:sz w:val="20"/>
-          <w:szCs w:val="20"/>
-        </w:rPr>
-        <w:t>Word</w:t>
-      </w:r>
-      <w:r>
-        <w:rPr>
-          <w:sz w:val="20"/>
-          <w:szCs w:val="20"/>
-        </w:rPr>
-        <w:t xml:space="preserve"> pour préparer les documents : « GitHub nous a permis de partager nos travaux. Word nous a permis d’organiser notre travail. » Cette organisation nous a permis de travailler en parallèle tout en respectant le cahier des charges.</w:t>
+        <w:t>Nous avons utilisé GitHub pour partager le code et Word pour préparer les documents : « GitHub nous a permis de partager nos travaux. Word nous a permis d’organiser notre travail. » Cette organisation nous a permis de travailler en parallèle tout en respectant le cahier des charges.</w:t>
       </w:r>
     </w:p>
     <w:p>
@@ -3010,7 +2778,7 @@
         </w:rPr>
         <w:t xml:space="preserve"> </w:t>
       </w:r>
-      <w:hyperlink w:history="1" r:id="rId8">
+      <w:hyperlink r:id="rId8" w:history="1">
         <w:r>
           <w:rPr>
             <w:rStyle w:val="Lienhypertexte"/>
@@ -3088,12 +2856,6 @@
           <w:szCs w:val="20"/>
         </w:rPr>
         <w:br/>
-      </w:r>
-      <w:r>
-        <w:rPr>
-          <w:sz w:val="20"/>
-          <w:szCs w:val="20"/>
-        </w:rPr>
         <w:t>Nous avons ajusté les fonctions pour qu’elles utilisent les mêmes paramètres (par exemple les coordonnées de Pac</w:t>
       </w:r>
       <w:r>
@@ -3102,12 +2864,6 @@
           <w:szCs w:val="20"/>
         </w:rPr>
         <w:noBreakHyphen/>
-      </w:r>
-      <w:r>
-        <w:rPr>
-          <w:sz w:val="20"/>
-          <w:szCs w:val="20"/>
-        </w:rPr>
         <w:t>Man et des fantômes, la carte, etc.).</w:t>
       </w:r>
     </w:p>
@@ -3149,7 +2905,23 @@
           <w:sz w:val="20"/>
           <w:szCs w:val="20"/>
         </w:rPr>
-        <w:t>Le code ajusterTailleJeu() adapte la taille du canvas à la fenêtre. Il fallait s’assurer que le labyrinthe reste lisible et que les cases ne deviennent pas trop petites.</w:t>
+        <w:t xml:space="preserve">Le code </w:t>
+      </w:r>
+      <w:proofErr w:type="gramStart"/>
+      <w:r>
+        <w:rPr>
+          <w:sz w:val="20"/>
+          <w:szCs w:val="20"/>
+        </w:rPr>
+        <w:t>ajusterTailleJeu(</w:t>
+      </w:r>
+      <w:proofErr w:type="gramEnd"/>
+      <w:r>
+        <w:rPr>
+          <w:sz w:val="20"/>
+          <w:szCs w:val="20"/>
+        </w:rPr>
+        <w:t>) adapte la taille du canvas à la fenêtre. Il fallait s’assurer que le labyrinthe reste lisible et que les cases ne deviennent pas trop petites.</w:t>
       </w:r>
       <w:r>
         <w:br/>
@@ -3184,23 +2956,7 @@
           <w:sz w:val="20"/>
           <w:szCs w:val="20"/>
         </w:rPr>
-        <w:t xml:space="preserve">Ce projet nous a permis de réaliser un </w:t>
-      </w:r>
-      <w:r>
-        <w:rPr>
-          <w:b w:val="0"/>
-          <w:bCs w:val="0"/>
-          <w:sz w:val="20"/>
-          <w:szCs w:val="20"/>
-        </w:rPr>
-        <w:t>jeu complet</w:t>
-      </w:r>
-      <w:r>
-        <w:rPr>
-          <w:sz w:val="20"/>
-          <w:szCs w:val="20"/>
-        </w:rPr>
-        <w:t xml:space="preserve"> jouable dans un navigateur, en respectant les consignes du professeur : interface HTML/CSS, logique en JavaScript, règles du jeu implémentées, IA simple pour les ennemis et rapport structuré.</w:t>
+        <w:t>Ce projet nous a permis de réaliser un jeu complet jouable dans un navigateur, en respectant les consignes du professeur : interface HTML/CSS, logique en JavaScript, règles du jeu implémentées, IA simple pour les ennemis et rapport structuré.</w:t>
       </w:r>
     </w:p>
     <w:p>
@@ -3285,12 +3041,6 @@
           <w:szCs w:val="20"/>
         </w:rPr>
         <w:noBreakHyphen/>
-      </w:r>
-      <w:r>
-        <w:rPr>
-          <w:sz w:val="20"/>
-          <w:szCs w:val="20"/>
-        </w:rPr>
         <w:t>Man peut se déplacer, manger des pastilles, le score augmente, les fantômes le poursuivent en utilisant BFS, et la partie se termine par une victoire ou une défaite selon la situation.</w:t>
       </w:r>
     </w:p>
@@ -3350,7 +3100,7 @@
           <w:sz w:val="20"/>
           <w:szCs w:val="20"/>
         </w:rPr>
-        <w:t xml:space="preserve"> d’autres cartes sur le même principe que carte1 et carte2 ;</w:t>
+        <w:t xml:space="preserve"> d’autres cartes sur le même principe que carte1 et carte2</w:t>
       </w:r>
     </w:p>
     <w:p>
@@ -3379,7 +3129,36 @@
           <w:sz w:val="20"/>
           <w:szCs w:val="20"/>
         </w:rPr>
-        <w:t xml:space="preserve"> la vitesse des fantômes pour varier la difficulté ;</w:t>
+        <w:t xml:space="preserve"> la vitesse des fantômes pour varier la difficulté</w:t>
+      </w:r>
+    </w:p>
+    <w:p>
+      <w:pPr>
+        <w:numPr>
+          <w:ilvl w:val="0"/>
+          <w:numId w:val="12"/>
+        </w:numPr>
+        <w:spacing w:after="0" w:line="240" w:lineRule="auto"/>
+        <w:ind w:left="714" w:hanging="357"/>
+        <w:jc w:val="both"/>
+        <w:rPr>
+          <w:sz w:val="20"/>
+          <w:szCs w:val="20"/>
+        </w:rPr>
+      </w:pPr>
+      <w:r>
+        <w:rPr>
+          <w:sz w:val="20"/>
+          <w:szCs w:val="20"/>
+        </w:rPr>
+        <w:t>Améliorer</w:t>
+      </w:r>
+      <w:r>
+        <w:rPr>
+          <w:sz w:val="20"/>
+          <w:szCs w:val="20"/>
+        </w:rPr>
+        <w:t xml:space="preserve"> encore le design (couleurs, animations) dans le fichier CSS</w:t>
       </w:r>
     </w:p>
     <w:p>
@@ -3401,20 +3180,13 @@
           <w:sz w:val="20"/>
           <w:szCs w:val="20"/>
         </w:rPr>
-        <w:t>Améliorer</w:t>
-      </w:r>
-      <w:r>
-        <w:rPr>
-          <w:sz w:val="20"/>
-          <w:szCs w:val="20"/>
-        </w:rPr>
-        <w:t xml:space="preserve"> encore le design (couleurs, animations) dans le fichier CSS.</w:t>
+        <w:t>Adapter la mise en page afin d’assurer une compatibilité mobile (responsive design)</w:t>
       </w:r>
     </w:p>
     <w:sectPr>
       <w:headerReference w:type="default" r:id="rId9"/>
       <w:footerReference w:type="default" r:id="rId10"/>
-      <w:pgSz w:w="11906" w:h="16838" w:orient="portrait"/>
+      <w:pgSz w:w="11906" w:h="16838"/>
       <w:pgMar w:top="993" w:right="1417" w:bottom="993" w:left="1417" w:header="284" w:footer="0" w:gutter="0"/>
       <w:cols w:space="708"/>
       <w:docGrid w:linePitch="360"/>
@@ -3625,12 +3397,6 @@
         <w:bCs/>
       </w:rPr>
       <w:noBreakHyphen/>
-    </w:r>
-    <w:r>
-      <w:rPr>
-        <w:b/>
-        <w:bCs/>
-      </w:rPr>
       <w:t>Man</w:t>
     </w:r>
   </w:p>
@@ -3656,7 +3422,7 @@
         <w:ind w:left="720" w:hanging="360"/>
       </w:pPr>
       <w:rPr>
-        <w:rFonts w:hint="default" w:ascii="Aptos" w:hAnsi="Aptos" w:eastAsiaTheme="minorHAnsi" w:cstheme="minorBidi"/>
+        <w:rFonts w:ascii="Aptos" w:eastAsiaTheme="minorHAnsi" w:hAnsi="Aptos" w:cstheme="minorBidi" w:hint="default"/>
       </w:rPr>
     </w:lvl>
     <w:lvl w:ilvl="1" w:tplc="040C0003" w:tentative="1">
@@ -3668,7 +3434,7 @@
         <w:ind w:left="1440" w:hanging="360"/>
       </w:pPr>
       <w:rPr>
-        <w:rFonts w:hint="default" w:ascii="Courier New" w:hAnsi="Courier New" w:cs="Courier New"/>
+        <w:rFonts w:ascii="Courier New" w:hAnsi="Courier New" w:cs="Courier New" w:hint="default"/>
       </w:rPr>
     </w:lvl>
     <w:lvl w:ilvl="2" w:tplc="040C0005" w:tentative="1">
@@ -3680,7 +3446,7 @@
         <w:ind w:left="2160" w:hanging="360"/>
       </w:pPr>
       <w:rPr>
-        <w:rFonts w:hint="default" w:ascii="Wingdings" w:hAnsi="Wingdings"/>
+        <w:rFonts w:ascii="Wingdings" w:hAnsi="Wingdings" w:hint="default"/>
       </w:rPr>
     </w:lvl>
     <w:lvl w:ilvl="3" w:tplc="040C0001" w:tentative="1">
@@ -3692,7 +3458,7 @@
         <w:ind w:left="2880" w:hanging="360"/>
       </w:pPr>
       <w:rPr>
-        <w:rFonts w:hint="default" w:ascii="Symbol" w:hAnsi="Symbol"/>
+        <w:rFonts w:ascii="Symbol" w:hAnsi="Symbol" w:hint="default"/>
       </w:rPr>
     </w:lvl>
     <w:lvl w:ilvl="4" w:tplc="040C0003" w:tentative="1">
@@ -3704,7 +3470,7 @@
         <w:ind w:left="3600" w:hanging="360"/>
       </w:pPr>
       <w:rPr>
-        <w:rFonts w:hint="default" w:ascii="Courier New" w:hAnsi="Courier New" w:cs="Courier New"/>
+        <w:rFonts w:ascii="Courier New" w:hAnsi="Courier New" w:cs="Courier New" w:hint="default"/>
       </w:rPr>
     </w:lvl>
     <w:lvl w:ilvl="5" w:tplc="040C0005" w:tentative="1">
@@ -3716,7 +3482,7 @@
         <w:ind w:left="4320" w:hanging="360"/>
       </w:pPr>
       <w:rPr>
-        <w:rFonts w:hint="default" w:ascii="Wingdings" w:hAnsi="Wingdings"/>
+        <w:rFonts w:ascii="Wingdings" w:hAnsi="Wingdings" w:hint="default"/>
       </w:rPr>
     </w:lvl>
     <w:lvl w:ilvl="6" w:tplc="040C0001" w:tentative="1">
@@ -3728,7 +3494,7 @@
         <w:ind w:left="5040" w:hanging="360"/>
       </w:pPr>
       <w:rPr>
-        <w:rFonts w:hint="default" w:ascii="Symbol" w:hAnsi="Symbol"/>
+        <w:rFonts w:ascii="Symbol" w:hAnsi="Symbol" w:hint="default"/>
       </w:rPr>
     </w:lvl>
     <w:lvl w:ilvl="7" w:tplc="040C0003" w:tentative="1">
@@ -3740,7 +3506,7 @@
         <w:ind w:left="5760" w:hanging="360"/>
       </w:pPr>
       <w:rPr>
-        <w:rFonts w:hint="default" w:ascii="Courier New" w:hAnsi="Courier New" w:cs="Courier New"/>
+        <w:rFonts w:ascii="Courier New" w:hAnsi="Courier New" w:cs="Courier New" w:hint="default"/>
       </w:rPr>
     </w:lvl>
     <w:lvl w:ilvl="8" w:tplc="040C0005" w:tentative="1">
@@ -3752,7 +3518,7 @@
         <w:ind w:left="6480" w:hanging="360"/>
       </w:pPr>
       <w:rPr>
-        <w:rFonts w:hint="default" w:ascii="Wingdings" w:hAnsi="Wingdings"/>
+        <w:rFonts w:ascii="Wingdings" w:hAnsi="Wingdings" w:hint="default"/>
       </w:rPr>
     </w:lvl>
   </w:abstractNum>
@@ -3772,7 +3538,7 @@
         <w:ind w:left="720" w:hanging="360"/>
       </w:pPr>
       <w:rPr>
-        <w:rFonts w:hint="default" w:ascii="Symbol" w:hAnsi="Symbol"/>
+        <w:rFonts w:ascii="Symbol" w:hAnsi="Symbol" w:hint="default"/>
         <w:sz w:val="20"/>
       </w:rPr>
     </w:lvl>
@@ -3788,7 +3554,7 @@
         <w:ind w:left="1440" w:hanging="360"/>
       </w:pPr>
       <w:rPr>
-        <w:rFonts w:hint="default" w:ascii="Courier New" w:hAnsi="Courier New"/>
+        <w:rFonts w:ascii="Courier New" w:hAnsi="Courier New" w:hint="default"/>
         <w:sz w:val="20"/>
       </w:rPr>
     </w:lvl>
@@ -3804,7 +3570,7 @@
         <w:ind w:left="2160" w:hanging="360"/>
       </w:pPr>
       <w:rPr>
-        <w:rFonts w:hint="default" w:ascii="Wingdings" w:hAnsi="Wingdings"/>
+        <w:rFonts w:ascii="Wingdings" w:hAnsi="Wingdings" w:hint="default"/>
         <w:sz w:val="20"/>
       </w:rPr>
     </w:lvl>
@@ -3820,7 +3586,7 @@
         <w:ind w:left="2880" w:hanging="360"/>
       </w:pPr>
       <w:rPr>
-        <w:rFonts w:hint="default" w:ascii="Wingdings" w:hAnsi="Wingdings"/>
+        <w:rFonts w:ascii="Wingdings" w:hAnsi="Wingdings" w:hint="default"/>
         <w:sz w:val="20"/>
       </w:rPr>
     </w:lvl>
@@ -3836,7 +3602,7 @@
         <w:ind w:left="3600" w:hanging="360"/>
       </w:pPr>
       <w:rPr>
-        <w:rFonts w:hint="default" w:ascii="Wingdings" w:hAnsi="Wingdings"/>
+        <w:rFonts w:ascii="Wingdings" w:hAnsi="Wingdings" w:hint="default"/>
         <w:sz w:val="20"/>
       </w:rPr>
     </w:lvl>
@@ -3852,7 +3618,7 @@
         <w:ind w:left="4320" w:hanging="360"/>
       </w:pPr>
       <w:rPr>
-        <w:rFonts w:hint="default" w:ascii="Wingdings" w:hAnsi="Wingdings"/>
+        <w:rFonts w:ascii="Wingdings" w:hAnsi="Wingdings" w:hint="default"/>
         <w:sz w:val="20"/>
       </w:rPr>
     </w:lvl>
@@ -3868,7 +3634,7 @@
         <w:ind w:left="5040" w:hanging="360"/>
       </w:pPr>
       <w:rPr>
-        <w:rFonts w:hint="default" w:ascii="Wingdings" w:hAnsi="Wingdings"/>
+        <w:rFonts w:ascii="Wingdings" w:hAnsi="Wingdings" w:hint="default"/>
         <w:sz w:val="20"/>
       </w:rPr>
     </w:lvl>
@@ -3884,7 +3650,7 @@
         <w:ind w:left="5760" w:hanging="360"/>
       </w:pPr>
       <w:rPr>
-        <w:rFonts w:hint="default" w:ascii="Wingdings" w:hAnsi="Wingdings"/>
+        <w:rFonts w:ascii="Wingdings" w:hAnsi="Wingdings" w:hint="default"/>
         <w:sz w:val="20"/>
       </w:rPr>
     </w:lvl>
@@ -3900,7 +3666,7 @@
         <w:ind w:left="6480" w:hanging="360"/>
       </w:pPr>
       <w:rPr>
-        <w:rFonts w:hint="default" w:ascii="Wingdings" w:hAnsi="Wingdings"/>
+        <w:rFonts w:ascii="Wingdings" w:hAnsi="Wingdings" w:hint="default"/>
         <w:sz w:val="20"/>
       </w:rPr>
     </w:lvl>
@@ -3921,7 +3687,7 @@
         <w:ind w:left="720" w:hanging="360"/>
       </w:pPr>
       <w:rPr>
-        <w:rFonts w:hint="default" w:ascii="Symbol" w:hAnsi="Symbol"/>
+        <w:rFonts w:ascii="Symbol" w:hAnsi="Symbol" w:hint="default"/>
         <w:sz w:val="20"/>
       </w:rPr>
     </w:lvl>
@@ -3937,7 +3703,7 @@
         <w:ind w:left="1440" w:hanging="360"/>
       </w:pPr>
       <w:rPr>
-        <w:rFonts w:hint="default" w:ascii="Courier New" w:hAnsi="Courier New"/>
+        <w:rFonts w:ascii="Courier New" w:hAnsi="Courier New" w:hint="default"/>
         <w:sz w:val="20"/>
       </w:rPr>
     </w:lvl>
@@ -3953,7 +3719,7 @@
         <w:ind w:left="2160" w:hanging="360"/>
       </w:pPr>
       <w:rPr>
-        <w:rFonts w:hint="default" w:ascii="Wingdings" w:hAnsi="Wingdings"/>
+        <w:rFonts w:ascii="Wingdings" w:hAnsi="Wingdings" w:hint="default"/>
         <w:sz w:val="20"/>
       </w:rPr>
     </w:lvl>
@@ -3969,7 +3735,7 @@
         <w:ind w:left="2880" w:hanging="360"/>
       </w:pPr>
       <w:rPr>
-        <w:rFonts w:hint="default" w:ascii="Wingdings" w:hAnsi="Wingdings"/>
+        <w:rFonts w:ascii="Wingdings" w:hAnsi="Wingdings" w:hint="default"/>
         <w:sz w:val="20"/>
       </w:rPr>
     </w:lvl>
@@ -3985,7 +3751,7 @@
         <w:ind w:left="3600" w:hanging="360"/>
       </w:pPr>
       <w:rPr>
-        <w:rFonts w:hint="default" w:ascii="Wingdings" w:hAnsi="Wingdings"/>
+        <w:rFonts w:ascii="Wingdings" w:hAnsi="Wingdings" w:hint="default"/>
         <w:sz w:val="20"/>
       </w:rPr>
     </w:lvl>
@@ -4001,7 +3767,7 @@
         <w:ind w:left="4320" w:hanging="360"/>
       </w:pPr>
       <w:rPr>
-        <w:rFonts w:hint="default" w:ascii="Wingdings" w:hAnsi="Wingdings"/>
+        <w:rFonts w:ascii="Wingdings" w:hAnsi="Wingdings" w:hint="default"/>
         <w:sz w:val="20"/>
       </w:rPr>
     </w:lvl>
@@ -4017,7 +3783,7 @@
         <w:ind w:left="5040" w:hanging="360"/>
       </w:pPr>
       <w:rPr>
-        <w:rFonts w:hint="default" w:ascii="Wingdings" w:hAnsi="Wingdings"/>
+        <w:rFonts w:ascii="Wingdings" w:hAnsi="Wingdings" w:hint="default"/>
         <w:sz w:val="20"/>
       </w:rPr>
     </w:lvl>
@@ -4033,7 +3799,7 @@
         <w:ind w:left="5760" w:hanging="360"/>
       </w:pPr>
       <w:rPr>
-        <w:rFonts w:hint="default" w:ascii="Wingdings" w:hAnsi="Wingdings"/>
+        <w:rFonts w:ascii="Wingdings" w:hAnsi="Wingdings" w:hint="default"/>
         <w:sz w:val="20"/>
       </w:rPr>
     </w:lvl>
@@ -4049,7 +3815,7 @@
         <w:ind w:left="6480" w:hanging="360"/>
       </w:pPr>
       <w:rPr>
-        <w:rFonts w:hint="default" w:ascii="Wingdings" w:hAnsi="Wingdings"/>
+        <w:rFonts w:ascii="Wingdings" w:hAnsi="Wingdings" w:hint="default"/>
         <w:sz w:val="20"/>
       </w:rPr>
     </w:lvl>
@@ -4070,7 +3836,7 @@
         <w:ind w:left="720" w:hanging="360"/>
       </w:pPr>
       <w:rPr>
-        <w:rFonts w:hint="default" w:ascii="Symbol" w:hAnsi="Symbol"/>
+        <w:rFonts w:ascii="Symbol" w:hAnsi="Symbol" w:hint="default"/>
         <w:sz w:val="20"/>
       </w:rPr>
     </w:lvl>
@@ -4086,7 +3852,7 @@
         <w:ind w:left="1440" w:hanging="360"/>
       </w:pPr>
       <w:rPr>
-        <w:rFonts w:hint="default" w:ascii="Courier New" w:hAnsi="Courier New"/>
+        <w:rFonts w:ascii="Courier New" w:hAnsi="Courier New" w:hint="default"/>
         <w:sz w:val="20"/>
       </w:rPr>
     </w:lvl>
@@ -4102,7 +3868,7 @@
         <w:ind w:left="2160" w:hanging="360"/>
       </w:pPr>
       <w:rPr>
-        <w:rFonts w:hint="default" w:ascii="Wingdings" w:hAnsi="Wingdings"/>
+        <w:rFonts w:ascii="Wingdings" w:hAnsi="Wingdings" w:hint="default"/>
         <w:sz w:val="20"/>
       </w:rPr>
     </w:lvl>
@@ -4118,7 +3884,7 @@
         <w:ind w:left="2880" w:hanging="360"/>
       </w:pPr>
       <w:rPr>
-        <w:rFonts w:hint="default" w:ascii="Wingdings" w:hAnsi="Wingdings"/>
+        <w:rFonts w:ascii="Wingdings" w:hAnsi="Wingdings" w:hint="default"/>
         <w:sz w:val="20"/>
       </w:rPr>
     </w:lvl>
@@ -4134,7 +3900,7 @@
         <w:ind w:left="3600" w:hanging="360"/>
       </w:pPr>
       <w:rPr>
-        <w:rFonts w:hint="default" w:ascii="Wingdings" w:hAnsi="Wingdings"/>
+        <w:rFonts w:ascii="Wingdings" w:hAnsi="Wingdings" w:hint="default"/>
         <w:sz w:val="20"/>
       </w:rPr>
     </w:lvl>
@@ -4150,7 +3916,7 @@
         <w:ind w:left="4320" w:hanging="360"/>
       </w:pPr>
       <w:rPr>
-        <w:rFonts w:hint="default" w:ascii="Wingdings" w:hAnsi="Wingdings"/>
+        <w:rFonts w:ascii="Wingdings" w:hAnsi="Wingdings" w:hint="default"/>
         <w:sz w:val="20"/>
       </w:rPr>
     </w:lvl>
@@ -4166,7 +3932,7 @@
         <w:ind w:left="5040" w:hanging="360"/>
       </w:pPr>
       <w:rPr>
-        <w:rFonts w:hint="default" w:ascii="Wingdings" w:hAnsi="Wingdings"/>
+        <w:rFonts w:ascii="Wingdings" w:hAnsi="Wingdings" w:hint="default"/>
         <w:sz w:val="20"/>
       </w:rPr>
     </w:lvl>
@@ -4182,7 +3948,7 @@
         <w:ind w:left="5760" w:hanging="360"/>
       </w:pPr>
       <w:rPr>
-        <w:rFonts w:hint="default" w:ascii="Wingdings" w:hAnsi="Wingdings"/>
+        <w:rFonts w:ascii="Wingdings" w:hAnsi="Wingdings" w:hint="default"/>
         <w:sz w:val="20"/>
       </w:rPr>
     </w:lvl>
@@ -4198,7 +3964,7 @@
         <w:ind w:left="6480" w:hanging="360"/>
       </w:pPr>
       <w:rPr>
-        <w:rFonts w:hint="default" w:ascii="Wingdings" w:hAnsi="Wingdings"/>
+        <w:rFonts w:ascii="Wingdings" w:hAnsi="Wingdings" w:hint="default"/>
         <w:sz w:val="20"/>
       </w:rPr>
     </w:lvl>
@@ -4219,7 +3985,7 @@
         <w:ind w:left="720" w:hanging="360"/>
       </w:pPr>
       <w:rPr>
-        <w:rFonts w:hint="default" w:ascii="Symbol" w:hAnsi="Symbol"/>
+        <w:rFonts w:ascii="Symbol" w:hAnsi="Symbol" w:hint="default"/>
         <w:sz w:val="20"/>
       </w:rPr>
     </w:lvl>
@@ -4235,7 +4001,7 @@
         <w:ind w:left="1440" w:hanging="360"/>
       </w:pPr>
       <w:rPr>
-        <w:rFonts w:hint="default" w:ascii="Courier New" w:hAnsi="Courier New"/>
+        <w:rFonts w:ascii="Courier New" w:hAnsi="Courier New" w:hint="default"/>
         <w:sz w:val="20"/>
       </w:rPr>
     </w:lvl>
@@ -4251,7 +4017,7 @@
         <w:ind w:left="2160" w:hanging="360"/>
       </w:pPr>
       <w:rPr>
-        <w:rFonts w:hint="default" w:ascii="Wingdings" w:hAnsi="Wingdings"/>
+        <w:rFonts w:ascii="Wingdings" w:hAnsi="Wingdings" w:hint="default"/>
         <w:sz w:val="20"/>
       </w:rPr>
     </w:lvl>
@@ -4267,7 +4033,7 @@
         <w:ind w:left="2880" w:hanging="360"/>
       </w:pPr>
       <w:rPr>
-        <w:rFonts w:hint="default" w:ascii="Wingdings" w:hAnsi="Wingdings"/>
+        <w:rFonts w:ascii="Wingdings" w:hAnsi="Wingdings" w:hint="default"/>
         <w:sz w:val="20"/>
       </w:rPr>
     </w:lvl>
@@ -4283,7 +4049,7 @@
         <w:ind w:left="3600" w:hanging="360"/>
       </w:pPr>
       <w:rPr>
-        <w:rFonts w:hint="default" w:ascii="Wingdings" w:hAnsi="Wingdings"/>
+        <w:rFonts w:ascii="Wingdings" w:hAnsi="Wingdings" w:hint="default"/>
         <w:sz w:val="20"/>
       </w:rPr>
     </w:lvl>
@@ -4299,7 +4065,7 @@
         <w:ind w:left="4320" w:hanging="360"/>
       </w:pPr>
       <w:rPr>
-        <w:rFonts w:hint="default" w:ascii="Wingdings" w:hAnsi="Wingdings"/>
+        <w:rFonts w:ascii="Wingdings" w:hAnsi="Wingdings" w:hint="default"/>
         <w:sz w:val="20"/>
       </w:rPr>
     </w:lvl>
@@ -4315,7 +4081,7 @@
         <w:ind w:left="5040" w:hanging="360"/>
       </w:pPr>
       <w:rPr>
-        <w:rFonts w:hint="default" w:ascii="Wingdings" w:hAnsi="Wingdings"/>
+        <w:rFonts w:ascii="Wingdings" w:hAnsi="Wingdings" w:hint="default"/>
         <w:sz w:val="20"/>
       </w:rPr>
     </w:lvl>
@@ -4331,7 +4097,7 @@
         <w:ind w:left="5760" w:hanging="360"/>
       </w:pPr>
       <w:rPr>
-        <w:rFonts w:hint="default" w:ascii="Wingdings" w:hAnsi="Wingdings"/>
+        <w:rFonts w:ascii="Wingdings" w:hAnsi="Wingdings" w:hint="default"/>
         <w:sz w:val="20"/>
       </w:rPr>
     </w:lvl>
@@ -4347,7 +4113,7 @@
         <w:ind w:left="6480" w:hanging="360"/>
       </w:pPr>
       <w:rPr>
-        <w:rFonts w:hint="default" w:ascii="Wingdings" w:hAnsi="Wingdings"/>
+        <w:rFonts w:ascii="Wingdings" w:hAnsi="Wingdings" w:hint="default"/>
         <w:sz w:val="20"/>
       </w:rPr>
     </w:lvl>
@@ -4368,7 +4134,7 @@
         <w:ind w:left="720" w:hanging="360"/>
       </w:pPr>
       <w:rPr>
-        <w:rFonts w:hint="default" w:ascii="Symbol" w:hAnsi="Symbol"/>
+        <w:rFonts w:ascii="Symbol" w:hAnsi="Symbol" w:hint="default"/>
         <w:sz w:val="20"/>
       </w:rPr>
     </w:lvl>
@@ -4384,7 +4150,7 @@
         <w:ind w:left="1440" w:hanging="360"/>
       </w:pPr>
       <w:rPr>
-        <w:rFonts w:hint="default" w:ascii="Courier New" w:hAnsi="Courier New"/>
+        <w:rFonts w:ascii="Courier New" w:hAnsi="Courier New" w:hint="default"/>
         <w:sz w:val="20"/>
       </w:rPr>
     </w:lvl>
@@ -4400,7 +4166,7 @@
         <w:ind w:left="2160" w:hanging="360"/>
       </w:pPr>
       <w:rPr>
-        <w:rFonts w:hint="default" w:ascii="Wingdings" w:hAnsi="Wingdings"/>
+        <w:rFonts w:ascii="Wingdings" w:hAnsi="Wingdings" w:hint="default"/>
         <w:sz w:val="20"/>
       </w:rPr>
     </w:lvl>
@@ -4416,7 +4182,7 @@
         <w:ind w:left="2880" w:hanging="360"/>
       </w:pPr>
       <w:rPr>
-        <w:rFonts w:hint="default" w:ascii="Wingdings" w:hAnsi="Wingdings"/>
+        <w:rFonts w:ascii="Wingdings" w:hAnsi="Wingdings" w:hint="default"/>
         <w:sz w:val="20"/>
       </w:rPr>
     </w:lvl>
@@ -4432,7 +4198,7 @@
         <w:ind w:left="3600" w:hanging="360"/>
       </w:pPr>
       <w:rPr>
-        <w:rFonts w:hint="default" w:ascii="Wingdings" w:hAnsi="Wingdings"/>
+        <w:rFonts w:ascii="Wingdings" w:hAnsi="Wingdings" w:hint="default"/>
         <w:sz w:val="20"/>
       </w:rPr>
     </w:lvl>
@@ -4448,7 +4214,7 @@
         <w:ind w:left="4320" w:hanging="360"/>
       </w:pPr>
       <w:rPr>
-        <w:rFonts w:hint="default" w:ascii="Wingdings" w:hAnsi="Wingdings"/>
+        <w:rFonts w:ascii="Wingdings" w:hAnsi="Wingdings" w:hint="default"/>
         <w:sz w:val="20"/>
       </w:rPr>
     </w:lvl>
@@ -4464,7 +4230,7 @@
         <w:ind w:left="5040" w:hanging="360"/>
       </w:pPr>
       <w:rPr>
-        <w:rFonts w:hint="default" w:ascii="Wingdings" w:hAnsi="Wingdings"/>
+        <w:rFonts w:ascii="Wingdings" w:hAnsi="Wingdings" w:hint="default"/>
         <w:sz w:val="20"/>
       </w:rPr>
     </w:lvl>
@@ -4480,7 +4246,7 @@
         <w:ind w:left="5760" w:hanging="360"/>
       </w:pPr>
       <w:rPr>
-        <w:rFonts w:hint="default" w:ascii="Wingdings" w:hAnsi="Wingdings"/>
+        <w:rFonts w:ascii="Wingdings" w:hAnsi="Wingdings" w:hint="default"/>
         <w:sz w:val="20"/>
       </w:rPr>
     </w:lvl>
@@ -4496,7 +4262,7 @@
         <w:ind w:left="6480" w:hanging="360"/>
       </w:pPr>
       <w:rPr>
-        <w:rFonts w:hint="default" w:ascii="Wingdings" w:hAnsi="Wingdings"/>
+        <w:rFonts w:ascii="Wingdings" w:hAnsi="Wingdings" w:hint="default"/>
         <w:sz w:val="20"/>
       </w:rPr>
     </w:lvl>
@@ -4517,7 +4283,7 @@
         <w:ind w:left="720" w:hanging="360"/>
       </w:pPr>
       <w:rPr>
-        <w:rFonts w:hint="default" w:ascii="Symbol" w:hAnsi="Symbol"/>
+        <w:rFonts w:ascii="Symbol" w:hAnsi="Symbol" w:hint="default"/>
         <w:sz w:val="20"/>
       </w:rPr>
     </w:lvl>
@@ -4533,7 +4299,7 @@
         <w:ind w:left="1440" w:hanging="360"/>
       </w:pPr>
       <w:rPr>
-        <w:rFonts w:hint="default" w:ascii="Courier New" w:hAnsi="Courier New"/>
+        <w:rFonts w:ascii="Courier New" w:hAnsi="Courier New" w:hint="default"/>
         <w:sz w:val="20"/>
       </w:rPr>
     </w:lvl>
@@ -4549,7 +4315,7 @@
         <w:ind w:left="2160" w:hanging="360"/>
       </w:pPr>
       <w:rPr>
-        <w:rFonts w:hint="default" w:ascii="Wingdings" w:hAnsi="Wingdings"/>
+        <w:rFonts w:ascii="Wingdings" w:hAnsi="Wingdings" w:hint="default"/>
         <w:sz w:val="20"/>
       </w:rPr>
     </w:lvl>
@@ -4565,7 +4331,7 @@
         <w:ind w:left="2880" w:hanging="360"/>
       </w:pPr>
       <w:rPr>
-        <w:rFonts w:hint="default" w:ascii="Wingdings" w:hAnsi="Wingdings"/>
+        <w:rFonts w:ascii="Wingdings" w:hAnsi="Wingdings" w:hint="default"/>
         <w:sz w:val="20"/>
       </w:rPr>
     </w:lvl>
@@ -4581,7 +4347,7 @@
         <w:ind w:left="3600" w:hanging="360"/>
       </w:pPr>
       <w:rPr>
-        <w:rFonts w:hint="default" w:ascii="Wingdings" w:hAnsi="Wingdings"/>
+        <w:rFonts w:ascii="Wingdings" w:hAnsi="Wingdings" w:hint="default"/>
         <w:sz w:val="20"/>
       </w:rPr>
     </w:lvl>
@@ -4597,7 +4363,7 @@
         <w:ind w:left="4320" w:hanging="360"/>
       </w:pPr>
       <w:rPr>
-        <w:rFonts w:hint="default" w:ascii="Wingdings" w:hAnsi="Wingdings"/>
+        <w:rFonts w:ascii="Wingdings" w:hAnsi="Wingdings" w:hint="default"/>
         <w:sz w:val="20"/>
       </w:rPr>
     </w:lvl>
@@ -4613,7 +4379,7 @@
         <w:ind w:left="5040" w:hanging="360"/>
       </w:pPr>
       <w:rPr>
-        <w:rFonts w:hint="default" w:ascii="Wingdings" w:hAnsi="Wingdings"/>
+        <w:rFonts w:ascii="Wingdings" w:hAnsi="Wingdings" w:hint="default"/>
         <w:sz w:val="20"/>
       </w:rPr>
     </w:lvl>
@@ -4629,7 +4395,7 @@
         <w:ind w:left="5760" w:hanging="360"/>
       </w:pPr>
       <w:rPr>
-        <w:rFonts w:hint="default" w:ascii="Wingdings" w:hAnsi="Wingdings"/>
+        <w:rFonts w:ascii="Wingdings" w:hAnsi="Wingdings" w:hint="default"/>
         <w:sz w:val="20"/>
       </w:rPr>
     </w:lvl>
@@ -4645,7 +4411,7 @@
         <w:ind w:left="6480" w:hanging="360"/>
       </w:pPr>
       <w:rPr>
-        <w:rFonts w:hint="default" w:ascii="Wingdings" w:hAnsi="Wingdings"/>
+        <w:rFonts w:ascii="Wingdings" w:hAnsi="Wingdings" w:hint="default"/>
         <w:sz w:val="20"/>
       </w:rPr>
     </w:lvl>
@@ -4666,7 +4432,7 @@
         <w:ind w:left="720" w:hanging="360"/>
       </w:pPr>
       <w:rPr>
-        <w:rFonts w:hint="default" w:ascii="Symbol" w:hAnsi="Symbol"/>
+        <w:rFonts w:ascii="Symbol" w:hAnsi="Symbol" w:hint="default"/>
         <w:sz w:val="20"/>
       </w:rPr>
     </w:lvl>
@@ -4682,7 +4448,7 @@
         <w:ind w:left="1440" w:hanging="360"/>
       </w:pPr>
       <w:rPr>
-        <w:rFonts w:hint="default" w:ascii="Courier New" w:hAnsi="Courier New"/>
+        <w:rFonts w:ascii="Courier New" w:hAnsi="Courier New" w:hint="default"/>
         <w:sz w:val="20"/>
       </w:rPr>
     </w:lvl>
@@ -4698,7 +4464,7 @@
         <w:ind w:left="2160" w:hanging="360"/>
       </w:pPr>
       <w:rPr>
-        <w:rFonts w:hint="default" w:ascii="Wingdings" w:hAnsi="Wingdings"/>
+        <w:rFonts w:ascii="Wingdings" w:hAnsi="Wingdings" w:hint="default"/>
         <w:sz w:val="20"/>
       </w:rPr>
     </w:lvl>
@@ -4714,7 +4480,7 @@
         <w:ind w:left="2880" w:hanging="360"/>
       </w:pPr>
       <w:rPr>
-        <w:rFonts w:hint="default" w:ascii="Wingdings" w:hAnsi="Wingdings"/>
+        <w:rFonts w:ascii="Wingdings" w:hAnsi="Wingdings" w:hint="default"/>
         <w:sz w:val="20"/>
       </w:rPr>
     </w:lvl>
@@ -4730,7 +4496,7 @@
         <w:ind w:left="3600" w:hanging="360"/>
       </w:pPr>
       <w:rPr>
-        <w:rFonts w:hint="default" w:ascii="Wingdings" w:hAnsi="Wingdings"/>
+        <w:rFonts w:ascii="Wingdings" w:hAnsi="Wingdings" w:hint="default"/>
         <w:sz w:val="20"/>
       </w:rPr>
     </w:lvl>
@@ -4746,7 +4512,7 @@
         <w:ind w:left="4320" w:hanging="360"/>
       </w:pPr>
       <w:rPr>
-        <w:rFonts w:hint="default" w:ascii="Wingdings" w:hAnsi="Wingdings"/>
+        <w:rFonts w:ascii="Wingdings" w:hAnsi="Wingdings" w:hint="default"/>
         <w:sz w:val="20"/>
       </w:rPr>
     </w:lvl>
@@ -4762,7 +4528,7 @@
         <w:ind w:left="5040" w:hanging="360"/>
       </w:pPr>
       <w:rPr>
-        <w:rFonts w:hint="default" w:ascii="Wingdings" w:hAnsi="Wingdings"/>
+        <w:rFonts w:ascii="Wingdings" w:hAnsi="Wingdings" w:hint="default"/>
         <w:sz w:val="20"/>
       </w:rPr>
     </w:lvl>
@@ -4778,7 +4544,7 @@
         <w:ind w:left="5760" w:hanging="360"/>
       </w:pPr>
       <w:rPr>
-        <w:rFonts w:hint="default" w:ascii="Wingdings" w:hAnsi="Wingdings"/>
+        <w:rFonts w:ascii="Wingdings" w:hAnsi="Wingdings" w:hint="default"/>
         <w:sz w:val="20"/>
       </w:rPr>
     </w:lvl>
@@ -4794,7 +4560,7 @@
         <w:ind w:left="6480" w:hanging="360"/>
       </w:pPr>
       <w:rPr>
-        <w:rFonts w:hint="default" w:ascii="Wingdings" w:hAnsi="Wingdings"/>
+        <w:rFonts w:ascii="Wingdings" w:hAnsi="Wingdings" w:hint="default"/>
         <w:sz w:val="20"/>
       </w:rPr>
     </w:lvl>
@@ -4910,7 +4676,7 @@
         <w:ind w:left="720" w:hanging="360"/>
       </w:pPr>
       <w:rPr>
-        <w:rFonts w:hint="default" w:ascii="Symbol" w:hAnsi="Symbol"/>
+        <w:rFonts w:ascii="Symbol" w:hAnsi="Symbol" w:hint="default"/>
         <w:sz w:val="20"/>
       </w:rPr>
     </w:lvl>
@@ -4926,7 +4692,7 @@
         <w:ind w:left="1440" w:hanging="360"/>
       </w:pPr>
       <w:rPr>
-        <w:rFonts w:hint="default" w:ascii="Courier New" w:hAnsi="Courier New"/>
+        <w:rFonts w:ascii="Courier New" w:hAnsi="Courier New" w:hint="default"/>
         <w:sz w:val="20"/>
       </w:rPr>
     </w:lvl>
@@ -4942,7 +4708,7 @@
         <w:ind w:left="2160" w:hanging="360"/>
       </w:pPr>
       <w:rPr>
-        <w:rFonts w:hint="default" w:ascii="Wingdings" w:hAnsi="Wingdings"/>
+        <w:rFonts w:ascii="Wingdings" w:hAnsi="Wingdings" w:hint="default"/>
         <w:sz w:val="20"/>
       </w:rPr>
     </w:lvl>
@@ -4958,7 +4724,7 @@
         <w:ind w:left="2880" w:hanging="360"/>
       </w:pPr>
       <w:rPr>
-        <w:rFonts w:hint="default" w:ascii="Wingdings" w:hAnsi="Wingdings"/>
+        <w:rFonts w:ascii="Wingdings" w:hAnsi="Wingdings" w:hint="default"/>
         <w:sz w:val="20"/>
       </w:rPr>
     </w:lvl>
@@ -4974,7 +4740,7 @@
         <w:ind w:left="3600" w:hanging="360"/>
       </w:pPr>
       <w:rPr>
-        <w:rFonts w:hint="default" w:ascii="Wingdings" w:hAnsi="Wingdings"/>
+        <w:rFonts w:ascii="Wingdings" w:hAnsi="Wingdings" w:hint="default"/>
         <w:sz w:val="20"/>
       </w:rPr>
     </w:lvl>
@@ -4990,7 +4756,7 @@
         <w:ind w:left="4320" w:hanging="360"/>
       </w:pPr>
       <w:rPr>
-        <w:rFonts w:hint="default" w:ascii="Wingdings" w:hAnsi="Wingdings"/>
+        <w:rFonts w:ascii="Wingdings" w:hAnsi="Wingdings" w:hint="default"/>
         <w:sz w:val="20"/>
       </w:rPr>
     </w:lvl>
@@ -5006,7 +4772,7 @@
         <w:ind w:left="5040" w:hanging="360"/>
       </w:pPr>
       <w:rPr>
-        <w:rFonts w:hint="default" w:ascii="Wingdings" w:hAnsi="Wingdings"/>
+        <w:rFonts w:ascii="Wingdings" w:hAnsi="Wingdings" w:hint="default"/>
         <w:sz w:val="20"/>
       </w:rPr>
     </w:lvl>
@@ -5022,7 +4788,7 @@
         <w:ind w:left="5760" w:hanging="360"/>
       </w:pPr>
       <w:rPr>
-        <w:rFonts w:hint="default" w:ascii="Wingdings" w:hAnsi="Wingdings"/>
+        <w:rFonts w:ascii="Wingdings" w:hAnsi="Wingdings" w:hint="default"/>
         <w:sz w:val="20"/>
       </w:rPr>
     </w:lvl>
@@ -5038,7 +4804,7 @@
         <w:ind w:left="6480" w:hanging="360"/>
       </w:pPr>
       <w:rPr>
-        <w:rFonts w:hint="default" w:ascii="Wingdings" w:hAnsi="Wingdings"/>
+        <w:rFonts w:ascii="Wingdings" w:hAnsi="Wingdings" w:hint="default"/>
         <w:sz w:val="20"/>
       </w:rPr>
     </w:lvl>
@@ -5059,7 +4825,7 @@
         <w:ind w:left="720" w:hanging="360"/>
       </w:pPr>
       <w:rPr>
-        <w:rFonts w:hint="default" w:ascii="Symbol" w:hAnsi="Symbol"/>
+        <w:rFonts w:ascii="Symbol" w:hAnsi="Symbol" w:hint="default"/>
         <w:sz w:val="20"/>
       </w:rPr>
     </w:lvl>
@@ -5075,7 +4841,7 @@
         <w:ind w:left="1440" w:hanging="360"/>
       </w:pPr>
       <w:rPr>
-        <w:rFonts w:hint="default" w:ascii="Courier New" w:hAnsi="Courier New"/>
+        <w:rFonts w:ascii="Courier New" w:hAnsi="Courier New" w:hint="default"/>
         <w:sz w:val="20"/>
       </w:rPr>
     </w:lvl>
@@ -5091,7 +4857,7 @@
         <w:ind w:left="2160" w:hanging="360"/>
       </w:pPr>
       <w:rPr>
-        <w:rFonts w:hint="default" w:ascii="Wingdings" w:hAnsi="Wingdings"/>
+        <w:rFonts w:ascii="Wingdings" w:hAnsi="Wingdings" w:hint="default"/>
         <w:sz w:val="20"/>
       </w:rPr>
     </w:lvl>
@@ -5107,7 +4873,7 @@
         <w:ind w:left="2880" w:hanging="360"/>
       </w:pPr>
       <w:rPr>
-        <w:rFonts w:hint="default" w:ascii="Wingdings" w:hAnsi="Wingdings"/>
+        <w:rFonts w:ascii="Wingdings" w:hAnsi="Wingdings" w:hint="default"/>
         <w:sz w:val="20"/>
       </w:rPr>
     </w:lvl>
@@ -5123,7 +4889,7 @@
         <w:ind w:left="3600" w:hanging="360"/>
       </w:pPr>
       <w:rPr>
-        <w:rFonts w:hint="default" w:ascii="Wingdings" w:hAnsi="Wingdings"/>
+        <w:rFonts w:ascii="Wingdings" w:hAnsi="Wingdings" w:hint="default"/>
         <w:sz w:val="20"/>
       </w:rPr>
     </w:lvl>
@@ -5139,7 +4905,7 @@
         <w:ind w:left="4320" w:hanging="360"/>
       </w:pPr>
       <w:rPr>
-        <w:rFonts w:hint="default" w:ascii="Wingdings" w:hAnsi="Wingdings"/>
+        <w:rFonts w:ascii="Wingdings" w:hAnsi="Wingdings" w:hint="default"/>
         <w:sz w:val="20"/>
       </w:rPr>
     </w:lvl>
@@ -5155,7 +4921,7 @@
         <w:ind w:left="5040" w:hanging="360"/>
       </w:pPr>
       <w:rPr>
-        <w:rFonts w:hint="default" w:ascii="Wingdings" w:hAnsi="Wingdings"/>
+        <w:rFonts w:ascii="Wingdings" w:hAnsi="Wingdings" w:hint="default"/>
         <w:sz w:val="20"/>
       </w:rPr>
     </w:lvl>
@@ -5171,7 +4937,7 @@
         <w:ind w:left="5760" w:hanging="360"/>
       </w:pPr>
       <w:rPr>
-        <w:rFonts w:hint="default" w:ascii="Wingdings" w:hAnsi="Wingdings"/>
+        <w:rFonts w:ascii="Wingdings" w:hAnsi="Wingdings" w:hint="default"/>
         <w:sz w:val="20"/>
       </w:rPr>
     </w:lvl>
@@ -5187,7 +4953,7 @@
         <w:ind w:left="6480" w:hanging="360"/>
       </w:pPr>
       <w:rPr>
-        <w:rFonts w:hint="default" w:ascii="Wingdings" w:hAnsi="Wingdings"/>
+        <w:rFonts w:ascii="Wingdings" w:hAnsi="Wingdings" w:hint="default"/>
         <w:sz w:val="20"/>
       </w:rPr>
     </w:lvl>
@@ -5208,7 +4974,7 @@
         <w:ind w:left="720" w:hanging="360"/>
       </w:pPr>
       <w:rPr>
-        <w:rFonts w:hint="default" w:ascii="Symbol" w:hAnsi="Symbol"/>
+        <w:rFonts w:ascii="Symbol" w:hAnsi="Symbol" w:hint="default"/>
         <w:sz w:val="20"/>
       </w:rPr>
     </w:lvl>
@@ -5224,7 +4990,7 @@
         <w:ind w:left="1440" w:hanging="360"/>
       </w:pPr>
       <w:rPr>
-        <w:rFonts w:hint="default" w:ascii="Courier New" w:hAnsi="Courier New"/>
+        <w:rFonts w:ascii="Courier New" w:hAnsi="Courier New" w:hint="default"/>
         <w:sz w:val="20"/>
       </w:rPr>
     </w:lvl>
@@ -5240,7 +5006,7 @@
         <w:ind w:left="2160" w:hanging="360"/>
       </w:pPr>
       <w:rPr>
-        <w:rFonts w:hint="default" w:ascii="Wingdings" w:hAnsi="Wingdings"/>
+        <w:rFonts w:ascii="Wingdings" w:hAnsi="Wingdings" w:hint="default"/>
         <w:sz w:val="20"/>
       </w:rPr>
     </w:lvl>
@@ -5256,7 +5022,7 @@
         <w:ind w:left="2880" w:hanging="360"/>
       </w:pPr>
       <w:rPr>
-        <w:rFonts w:hint="default" w:ascii="Wingdings" w:hAnsi="Wingdings"/>
+        <w:rFonts w:ascii="Wingdings" w:hAnsi="Wingdings" w:hint="default"/>
         <w:sz w:val="20"/>
       </w:rPr>
     </w:lvl>
@@ -5272,7 +5038,7 @@
         <w:ind w:left="3600" w:hanging="360"/>
       </w:pPr>
       <w:rPr>
-        <w:rFonts w:hint="default" w:ascii="Wingdings" w:hAnsi="Wingdings"/>
+        <w:rFonts w:ascii="Wingdings" w:hAnsi="Wingdings" w:hint="default"/>
         <w:sz w:val="20"/>
       </w:rPr>
     </w:lvl>
@@ -5288,7 +5054,7 @@
         <w:ind w:left="4320" w:hanging="360"/>
       </w:pPr>
       <w:rPr>
-        <w:rFonts w:hint="default" w:ascii="Wingdings" w:hAnsi="Wingdings"/>
+        <w:rFonts w:ascii="Wingdings" w:hAnsi="Wingdings" w:hint="default"/>
         <w:sz w:val="20"/>
       </w:rPr>
     </w:lvl>
@@ -5304,7 +5070,7 @@
         <w:ind w:left="5040" w:hanging="360"/>
       </w:pPr>
       <w:rPr>
-        <w:rFonts w:hint="default" w:ascii="Wingdings" w:hAnsi="Wingdings"/>
+        <w:rFonts w:ascii="Wingdings" w:hAnsi="Wingdings" w:hint="default"/>
         <w:sz w:val="20"/>
       </w:rPr>
     </w:lvl>
@@ -5320,7 +5086,7 @@
         <w:ind w:left="5760" w:hanging="360"/>
       </w:pPr>
       <w:rPr>
-        <w:rFonts w:hint="default" w:ascii="Wingdings" w:hAnsi="Wingdings"/>
+        <w:rFonts w:ascii="Wingdings" w:hAnsi="Wingdings" w:hint="default"/>
         <w:sz w:val="20"/>
       </w:rPr>
     </w:lvl>
@@ -5336,7 +5102,7 @@
         <w:ind w:left="6480" w:hanging="360"/>
       </w:pPr>
       <w:rPr>
-        <w:rFonts w:hint="default" w:ascii="Wingdings" w:hAnsi="Wingdings"/>
+        <w:rFonts w:ascii="Wingdings" w:hAnsi="Wingdings" w:hint="default"/>
         <w:sz w:val="20"/>
       </w:rPr>
     </w:lvl>
@@ -5443,7 +5209,7 @@
         <w:ind w:left="720" w:hanging="360"/>
       </w:pPr>
       <w:rPr>
-        <w:rFonts w:hint="default" w:ascii="Symbol" w:hAnsi="Symbol"/>
+        <w:rFonts w:ascii="Symbol" w:hAnsi="Symbol" w:hint="default"/>
         <w:sz w:val="20"/>
       </w:rPr>
     </w:lvl>
@@ -5459,7 +5225,7 @@
         <w:ind w:left="1440" w:hanging="360"/>
       </w:pPr>
       <w:rPr>
-        <w:rFonts w:hint="default" w:ascii="Courier New" w:hAnsi="Courier New"/>
+        <w:rFonts w:ascii="Courier New" w:hAnsi="Courier New" w:hint="default"/>
         <w:sz w:val="20"/>
       </w:rPr>
     </w:lvl>
@@ -5475,7 +5241,7 @@
         <w:ind w:left="2160" w:hanging="360"/>
       </w:pPr>
       <w:rPr>
-        <w:rFonts w:hint="default" w:ascii="Wingdings" w:hAnsi="Wingdings"/>
+        <w:rFonts w:ascii="Wingdings" w:hAnsi="Wingdings" w:hint="default"/>
         <w:sz w:val="20"/>
       </w:rPr>
     </w:lvl>
@@ -5491,7 +5257,7 @@
         <w:ind w:left="2880" w:hanging="360"/>
       </w:pPr>
       <w:rPr>
-        <w:rFonts w:hint="default" w:ascii="Wingdings" w:hAnsi="Wingdings"/>
+        <w:rFonts w:ascii="Wingdings" w:hAnsi="Wingdings" w:hint="default"/>
         <w:sz w:val="20"/>
       </w:rPr>
     </w:lvl>
@@ -5507,7 +5273,7 @@
         <w:ind w:left="3600" w:hanging="360"/>
       </w:pPr>
       <w:rPr>
-        <w:rFonts w:hint="default" w:ascii="Wingdings" w:hAnsi="Wingdings"/>
+        <w:rFonts w:ascii="Wingdings" w:hAnsi="Wingdings" w:hint="default"/>
         <w:sz w:val="20"/>
       </w:rPr>
     </w:lvl>
@@ -5523,7 +5289,7 @@
         <w:ind w:left="4320" w:hanging="360"/>
       </w:pPr>
       <w:rPr>
-        <w:rFonts w:hint="default" w:ascii="Wingdings" w:hAnsi="Wingdings"/>
+        <w:rFonts w:ascii="Wingdings" w:hAnsi="Wingdings" w:hint="default"/>
         <w:sz w:val="20"/>
       </w:rPr>
     </w:lvl>
@@ -5539,7 +5305,7 @@
         <w:ind w:left="5040" w:hanging="360"/>
       </w:pPr>
       <w:rPr>
-        <w:rFonts w:hint="default" w:ascii="Wingdings" w:hAnsi="Wingdings"/>
+        <w:rFonts w:ascii="Wingdings" w:hAnsi="Wingdings" w:hint="default"/>
         <w:sz w:val="20"/>
       </w:rPr>
     </w:lvl>
@@ -5555,7 +5321,7 @@
         <w:ind w:left="5760" w:hanging="360"/>
       </w:pPr>
       <w:rPr>
-        <w:rFonts w:hint="default" w:ascii="Wingdings" w:hAnsi="Wingdings"/>
+        <w:rFonts w:ascii="Wingdings" w:hAnsi="Wingdings" w:hint="default"/>
         <w:sz w:val="20"/>
       </w:rPr>
     </w:lvl>
@@ -5571,7 +5337,7 @@
         <w:ind w:left="6480" w:hanging="360"/>
       </w:pPr>
       <w:rPr>
-        <w:rFonts w:hint="default" w:ascii="Wingdings" w:hAnsi="Wingdings"/>
+        <w:rFonts w:ascii="Wingdings" w:hAnsi="Wingdings" w:hint="default"/>
         <w:sz w:val="20"/>
       </w:rPr>
     </w:lvl>
@@ -5705,7 +5471,7 @@
         <w:ind w:left="720" w:hanging="360"/>
       </w:pPr>
       <w:rPr>
-        <w:rFonts w:hint="default" w:ascii="Symbol" w:hAnsi="Symbol"/>
+        <w:rFonts w:ascii="Symbol" w:hAnsi="Symbol" w:hint="default"/>
         <w:sz w:val="20"/>
       </w:rPr>
     </w:lvl>
@@ -5721,7 +5487,7 @@
         <w:ind w:left="1440" w:hanging="360"/>
       </w:pPr>
       <w:rPr>
-        <w:rFonts w:hint="default" w:ascii="Courier New" w:hAnsi="Courier New"/>
+        <w:rFonts w:ascii="Courier New" w:hAnsi="Courier New" w:hint="default"/>
         <w:sz w:val="20"/>
       </w:rPr>
     </w:lvl>
@@ -5737,7 +5503,7 @@
         <w:ind w:left="2160" w:hanging="360"/>
       </w:pPr>
       <w:rPr>
-        <w:rFonts w:hint="default" w:ascii="Wingdings" w:hAnsi="Wingdings"/>
+        <w:rFonts w:ascii="Wingdings" w:hAnsi="Wingdings" w:hint="default"/>
         <w:sz w:val="20"/>
       </w:rPr>
     </w:lvl>
@@ -5753,7 +5519,7 @@
         <w:ind w:left="2880" w:hanging="360"/>
       </w:pPr>
       <w:rPr>
-        <w:rFonts w:hint="default" w:ascii="Wingdings" w:hAnsi="Wingdings"/>
+        <w:rFonts w:ascii="Wingdings" w:hAnsi="Wingdings" w:hint="default"/>
         <w:sz w:val="20"/>
       </w:rPr>
     </w:lvl>
@@ -5769,7 +5535,7 @@
         <w:ind w:left="3600" w:hanging="360"/>
       </w:pPr>
       <w:rPr>
-        <w:rFonts w:hint="default" w:ascii="Wingdings" w:hAnsi="Wingdings"/>
+        <w:rFonts w:ascii="Wingdings" w:hAnsi="Wingdings" w:hint="default"/>
         <w:sz w:val="20"/>
       </w:rPr>
     </w:lvl>
@@ -5785,7 +5551,7 @@
         <w:ind w:left="4320" w:hanging="360"/>
       </w:pPr>
       <w:rPr>
-        <w:rFonts w:hint="default" w:ascii="Wingdings" w:hAnsi="Wingdings"/>
+        <w:rFonts w:ascii="Wingdings" w:hAnsi="Wingdings" w:hint="default"/>
         <w:sz w:val="20"/>
       </w:rPr>
     </w:lvl>
@@ -5801,7 +5567,7 @@
         <w:ind w:left="5040" w:hanging="360"/>
       </w:pPr>
       <w:rPr>
-        <w:rFonts w:hint="default" w:ascii="Wingdings" w:hAnsi="Wingdings"/>
+        <w:rFonts w:ascii="Wingdings" w:hAnsi="Wingdings" w:hint="default"/>
         <w:sz w:val="20"/>
       </w:rPr>
     </w:lvl>
@@ -5817,7 +5583,7 @@
         <w:ind w:left="5760" w:hanging="360"/>
       </w:pPr>
       <w:rPr>
-        <w:rFonts w:hint="default" w:ascii="Wingdings" w:hAnsi="Wingdings"/>
+        <w:rFonts w:ascii="Wingdings" w:hAnsi="Wingdings" w:hint="default"/>
         <w:sz w:val="20"/>
       </w:rPr>
     </w:lvl>
@@ -5833,7 +5599,7 @@
         <w:ind w:left="6480" w:hanging="360"/>
       </w:pPr>
       <w:rPr>
-        <w:rFonts w:hint="default" w:ascii="Wingdings" w:hAnsi="Wingdings"/>
+        <w:rFonts w:ascii="Wingdings" w:hAnsi="Wingdings" w:hint="default"/>
         <w:sz w:val="20"/>
       </w:rPr>
     </w:lvl>
@@ -5854,7 +5620,7 @@
         <w:ind w:left="720" w:hanging="360"/>
       </w:pPr>
       <w:rPr>
-        <w:rFonts w:hint="default" w:ascii="Symbol" w:hAnsi="Symbol"/>
+        <w:rFonts w:ascii="Symbol" w:hAnsi="Symbol" w:hint="default"/>
         <w:sz w:val="20"/>
       </w:rPr>
     </w:lvl>
@@ -5870,7 +5636,7 @@
         <w:ind w:left="1440" w:hanging="360"/>
       </w:pPr>
       <w:rPr>
-        <w:rFonts w:hint="default" w:ascii="Courier New" w:hAnsi="Courier New"/>
+        <w:rFonts w:ascii="Courier New" w:hAnsi="Courier New" w:hint="default"/>
         <w:sz w:val="20"/>
       </w:rPr>
     </w:lvl>
@@ -5886,7 +5652,7 @@
         <w:ind w:left="2160" w:hanging="360"/>
       </w:pPr>
       <w:rPr>
-        <w:rFonts w:hint="default" w:ascii="Wingdings" w:hAnsi="Wingdings"/>
+        <w:rFonts w:ascii="Wingdings" w:hAnsi="Wingdings" w:hint="default"/>
         <w:sz w:val="20"/>
       </w:rPr>
     </w:lvl>
@@ -5902,7 +5668,7 @@
         <w:ind w:left="2880" w:hanging="360"/>
       </w:pPr>
       <w:rPr>
-        <w:rFonts w:hint="default" w:ascii="Wingdings" w:hAnsi="Wingdings"/>
+        <w:rFonts w:ascii="Wingdings" w:hAnsi="Wingdings" w:hint="default"/>
         <w:sz w:val="20"/>
       </w:rPr>
     </w:lvl>
@@ -5918,7 +5684,7 @@
         <w:ind w:left="3600" w:hanging="360"/>
       </w:pPr>
       <w:rPr>
-        <w:rFonts w:hint="default" w:ascii="Wingdings" w:hAnsi="Wingdings"/>
+        <w:rFonts w:ascii="Wingdings" w:hAnsi="Wingdings" w:hint="default"/>
         <w:sz w:val="20"/>
       </w:rPr>
     </w:lvl>
@@ -5934,7 +5700,7 @@
         <w:ind w:left="4320" w:hanging="360"/>
       </w:pPr>
       <w:rPr>
-        <w:rFonts w:hint="default" w:ascii="Wingdings" w:hAnsi="Wingdings"/>
+        <w:rFonts w:ascii="Wingdings" w:hAnsi="Wingdings" w:hint="default"/>
         <w:sz w:val="20"/>
       </w:rPr>
     </w:lvl>
@@ -5950,7 +5716,7 @@
         <w:ind w:left="5040" w:hanging="360"/>
       </w:pPr>
       <w:rPr>
-        <w:rFonts w:hint="default" w:ascii="Wingdings" w:hAnsi="Wingdings"/>
+        <w:rFonts w:ascii="Wingdings" w:hAnsi="Wingdings" w:hint="default"/>
         <w:sz w:val="20"/>
       </w:rPr>
     </w:lvl>
@@ -5966,7 +5732,7 @@
         <w:ind w:left="5760" w:hanging="360"/>
       </w:pPr>
       <w:rPr>
-        <w:rFonts w:hint="default" w:ascii="Wingdings" w:hAnsi="Wingdings"/>
+        <w:rFonts w:ascii="Wingdings" w:hAnsi="Wingdings" w:hint="default"/>
         <w:sz w:val="20"/>
       </w:rPr>
     </w:lvl>
@@ -5982,7 +5748,7 @@
         <w:ind w:left="6480" w:hanging="360"/>
       </w:pPr>
       <w:rPr>
-        <w:rFonts w:hint="default" w:ascii="Wingdings" w:hAnsi="Wingdings"/>
+        <w:rFonts w:ascii="Wingdings" w:hAnsi="Wingdings" w:hint="default"/>
         <w:sz w:val="20"/>
       </w:rPr>
     </w:lvl>
@@ -6003,7 +5769,7 @@
         <w:ind w:left="720" w:hanging="360"/>
       </w:pPr>
       <w:rPr>
-        <w:rFonts w:hint="default" w:ascii="Symbol" w:hAnsi="Symbol"/>
+        <w:rFonts w:ascii="Symbol" w:hAnsi="Symbol" w:hint="default"/>
         <w:sz w:val="20"/>
       </w:rPr>
     </w:lvl>
@@ -6019,7 +5785,7 @@
         <w:ind w:left="1440" w:hanging="360"/>
       </w:pPr>
       <w:rPr>
-        <w:rFonts w:hint="default" w:ascii="Courier New" w:hAnsi="Courier New"/>
+        <w:rFonts w:ascii="Courier New" w:hAnsi="Courier New" w:hint="default"/>
         <w:sz w:val="20"/>
       </w:rPr>
     </w:lvl>
@@ -6035,7 +5801,7 @@
         <w:ind w:left="2160" w:hanging="360"/>
       </w:pPr>
       <w:rPr>
-        <w:rFonts w:hint="default" w:ascii="Wingdings" w:hAnsi="Wingdings"/>
+        <w:rFonts w:ascii="Wingdings" w:hAnsi="Wingdings" w:hint="default"/>
         <w:sz w:val="20"/>
       </w:rPr>
     </w:lvl>
@@ -6051,7 +5817,7 @@
         <w:ind w:left="2880" w:hanging="360"/>
       </w:pPr>
       <w:rPr>
-        <w:rFonts w:hint="default" w:ascii="Wingdings" w:hAnsi="Wingdings"/>
+        <w:rFonts w:ascii="Wingdings" w:hAnsi="Wingdings" w:hint="default"/>
         <w:sz w:val="20"/>
       </w:rPr>
     </w:lvl>
@@ -6067,7 +5833,7 @@
         <w:ind w:left="3600" w:hanging="360"/>
       </w:pPr>
       <w:rPr>
-        <w:rFonts w:hint="default" w:ascii="Wingdings" w:hAnsi="Wingdings"/>
+        <w:rFonts w:ascii="Wingdings" w:hAnsi="Wingdings" w:hint="default"/>
         <w:sz w:val="20"/>
       </w:rPr>
     </w:lvl>
@@ -6083,7 +5849,7 @@
         <w:ind w:left="4320" w:hanging="360"/>
       </w:pPr>
       <w:rPr>
-        <w:rFonts w:hint="default" w:ascii="Wingdings" w:hAnsi="Wingdings"/>
+        <w:rFonts w:ascii="Wingdings" w:hAnsi="Wingdings" w:hint="default"/>
         <w:sz w:val="20"/>
       </w:rPr>
     </w:lvl>
@@ -6099,7 +5865,7 @@
         <w:ind w:left="5040" w:hanging="360"/>
       </w:pPr>
       <w:rPr>
-        <w:rFonts w:hint="default" w:ascii="Wingdings" w:hAnsi="Wingdings"/>
+        <w:rFonts w:ascii="Wingdings" w:hAnsi="Wingdings" w:hint="default"/>
         <w:sz w:val="20"/>
       </w:rPr>
     </w:lvl>
@@ -6115,7 +5881,7 @@
         <w:ind w:left="5760" w:hanging="360"/>
       </w:pPr>
       <w:rPr>
-        <w:rFonts w:hint="default" w:ascii="Wingdings" w:hAnsi="Wingdings"/>
+        <w:rFonts w:ascii="Wingdings" w:hAnsi="Wingdings" w:hint="default"/>
         <w:sz w:val="20"/>
       </w:rPr>
     </w:lvl>
@@ -6131,7 +5897,7 @@
         <w:ind w:left="6480" w:hanging="360"/>
       </w:pPr>
       <w:rPr>
-        <w:rFonts w:hint="default" w:ascii="Wingdings" w:hAnsi="Wingdings"/>
+        <w:rFonts w:ascii="Wingdings" w:hAnsi="Wingdings" w:hint="default"/>
         <w:sz w:val="20"/>
       </w:rPr>
     </w:lvl>
@@ -6152,7 +5918,7 @@
         <w:ind w:left="720" w:hanging="360"/>
       </w:pPr>
       <w:rPr>
-        <w:rFonts w:hint="default" w:ascii="Symbol" w:hAnsi="Symbol"/>
+        <w:rFonts w:ascii="Symbol" w:hAnsi="Symbol" w:hint="default"/>
         <w:sz w:val="20"/>
       </w:rPr>
     </w:lvl>
@@ -6168,7 +5934,7 @@
         <w:ind w:left="1440" w:hanging="360"/>
       </w:pPr>
       <w:rPr>
-        <w:rFonts w:hint="default" w:ascii="Courier New" w:hAnsi="Courier New"/>
+        <w:rFonts w:ascii="Courier New" w:hAnsi="Courier New" w:hint="default"/>
         <w:sz w:val="20"/>
       </w:rPr>
     </w:lvl>
@@ -6184,7 +5950,7 @@
         <w:ind w:left="2160" w:hanging="360"/>
       </w:pPr>
       <w:rPr>
-        <w:rFonts w:hint="default" w:ascii="Wingdings" w:hAnsi="Wingdings"/>
+        <w:rFonts w:ascii="Wingdings" w:hAnsi="Wingdings" w:hint="default"/>
         <w:sz w:val="20"/>
       </w:rPr>
     </w:lvl>
@@ -6200,7 +5966,7 @@
         <w:ind w:left="2880" w:hanging="360"/>
       </w:pPr>
       <w:rPr>
-        <w:rFonts w:hint="default" w:ascii="Wingdings" w:hAnsi="Wingdings"/>
+        <w:rFonts w:ascii="Wingdings" w:hAnsi="Wingdings" w:hint="default"/>
         <w:sz w:val="20"/>
       </w:rPr>
     </w:lvl>
@@ -6216,7 +5982,7 @@
         <w:ind w:left="3600" w:hanging="360"/>
       </w:pPr>
       <w:rPr>
-        <w:rFonts w:hint="default" w:ascii="Wingdings" w:hAnsi="Wingdings"/>
+        <w:rFonts w:ascii="Wingdings" w:hAnsi="Wingdings" w:hint="default"/>
         <w:sz w:val="20"/>
       </w:rPr>
     </w:lvl>
@@ -6232,7 +5998,7 @@
         <w:ind w:left="4320" w:hanging="360"/>
       </w:pPr>
       <w:rPr>
-        <w:rFonts w:hint="default" w:ascii="Wingdings" w:hAnsi="Wingdings"/>
+        <w:rFonts w:ascii="Wingdings" w:hAnsi="Wingdings" w:hint="default"/>
         <w:sz w:val="20"/>
       </w:rPr>
     </w:lvl>
@@ -6248,7 +6014,7 @@
         <w:ind w:left="5040" w:hanging="360"/>
       </w:pPr>
       <w:rPr>
-        <w:rFonts w:hint="default" w:ascii="Wingdings" w:hAnsi="Wingdings"/>
+        <w:rFonts w:ascii="Wingdings" w:hAnsi="Wingdings" w:hint="default"/>
         <w:sz w:val="20"/>
       </w:rPr>
     </w:lvl>
@@ -6264,7 +6030,7 @@
         <w:ind w:left="5760" w:hanging="360"/>
       </w:pPr>
       <w:rPr>
-        <w:rFonts w:hint="default" w:ascii="Wingdings" w:hAnsi="Wingdings"/>
+        <w:rFonts w:ascii="Wingdings" w:hAnsi="Wingdings" w:hint="default"/>
         <w:sz w:val="20"/>
       </w:rPr>
     </w:lvl>
@@ -6280,7 +6046,7 @@
         <w:ind w:left="6480" w:hanging="360"/>
       </w:pPr>
       <w:rPr>
-        <w:rFonts w:hint="default" w:ascii="Wingdings" w:hAnsi="Wingdings"/>
+        <w:rFonts w:ascii="Wingdings" w:hAnsi="Wingdings" w:hint="default"/>
         <w:sz w:val="20"/>
       </w:rPr>
     </w:lvl>
@@ -6301,7 +6067,7 @@
         <w:ind w:left="720" w:hanging="360"/>
       </w:pPr>
       <w:rPr>
-        <w:rFonts w:hint="default" w:ascii="Symbol" w:hAnsi="Symbol"/>
+        <w:rFonts w:ascii="Symbol" w:hAnsi="Symbol" w:hint="default"/>
         <w:sz w:val="20"/>
       </w:rPr>
     </w:lvl>
@@ -6317,7 +6083,7 @@
         <w:ind w:left="1440" w:hanging="360"/>
       </w:pPr>
       <w:rPr>
-        <w:rFonts w:hint="default" w:ascii="Courier New" w:hAnsi="Courier New"/>
+        <w:rFonts w:ascii="Courier New" w:hAnsi="Courier New" w:hint="default"/>
         <w:sz w:val="20"/>
       </w:rPr>
     </w:lvl>
@@ -6333,7 +6099,7 @@
         <w:ind w:left="2160" w:hanging="360"/>
       </w:pPr>
       <w:rPr>
-        <w:rFonts w:hint="default" w:ascii="Wingdings" w:hAnsi="Wingdings"/>
+        <w:rFonts w:ascii="Wingdings" w:hAnsi="Wingdings" w:hint="default"/>
         <w:sz w:val="20"/>
       </w:rPr>
     </w:lvl>
@@ -6349,7 +6115,7 @@
         <w:ind w:left="2880" w:hanging="360"/>
       </w:pPr>
       <w:rPr>
-        <w:rFonts w:hint="default" w:ascii="Wingdings" w:hAnsi="Wingdings"/>
+        <w:rFonts w:ascii="Wingdings" w:hAnsi="Wingdings" w:hint="default"/>
         <w:sz w:val="20"/>
       </w:rPr>
     </w:lvl>
@@ -6365,7 +6131,7 @@
         <w:ind w:left="3600" w:hanging="360"/>
       </w:pPr>
       <w:rPr>
-        <w:rFonts w:hint="default" w:ascii="Wingdings" w:hAnsi="Wingdings"/>
+        <w:rFonts w:ascii="Wingdings" w:hAnsi="Wingdings" w:hint="default"/>
         <w:sz w:val="20"/>
       </w:rPr>
     </w:lvl>
@@ -6381,7 +6147,7 @@
         <w:ind w:left="4320" w:hanging="360"/>
       </w:pPr>
       <w:rPr>
-        <w:rFonts w:hint="default" w:ascii="Wingdings" w:hAnsi="Wingdings"/>
+        <w:rFonts w:ascii="Wingdings" w:hAnsi="Wingdings" w:hint="default"/>
         <w:sz w:val="20"/>
       </w:rPr>
     </w:lvl>
@@ -6397,7 +6163,7 @@
         <w:ind w:left="5040" w:hanging="360"/>
       </w:pPr>
       <w:rPr>
-        <w:rFonts w:hint="default" w:ascii="Wingdings" w:hAnsi="Wingdings"/>
+        <w:rFonts w:ascii="Wingdings" w:hAnsi="Wingdings" w:hint="default"/>
         <w:sz w:val="20"/>
       </w:rPr>
     </w:lvl>
@@ -6413,7 +6179,7 @@
         <w:ind w:left="5760" w:hanging="360"/>
       </w:pPr>
       <w:rPr>
-        <w:rFonts w:hint="default" w:ascii="Wingdings" w:hAnsi="Wingdings"/>
+        <w:rFonts w:ascii="Wingdings" w:hAnsi="Wingdings" w:hint="default"/>
         <w:sz w:val="20"/>
       </w:rPr>
     </w:lvl>
@@ -6429,7 +6195,7 @@
         <w:ind w:left="6480" w:hanging="360"/>
       </w:pPr>
       <w:rPr>
-        <w:rFonts w:hint="default" w:ascii="Wingdings" w:hAnsi="Wingdings"/>
+        <w:rFonts w:ascii="Wingdings" w:hAnsi="Wingdings" w:hint="default"/>
         <w:sz w:val="20"/>
       </w:rPr>
     </w:lvl>
@@ -6499,11 +6265,11 @@
 </file>
 
 <file path=word/styles.xml><?xml version="1.0" encoding="utf-8"?>
-<w:styles xmlns:wp14="http://schemas.microsoft.com/office/word/2010/wordprocessingDrawing" xmlns:mc="http://schemas.openxmlformats.org/markup-compatibility/2006" xmlns:r="http://schemas.openxmlformats.org/officeDocument/2006/relationships" xmlns:w="http://schemas.openxmlformats.org/wordprocessingml/2006/main" xmlns:w14="http://schemas.microsoft.com/office/word/2010/wordml" xmlns:w15="http://schemas.microsoft.com/office/word/2012/wordml" xmlns:w16cex="http://schemas.microsoft.com/office/word/2018/wordml/cex" xmlns:w16cid="http://schemas.microsoft.com/office/word/2016/wordml/cid" xmlns:w16="http://schemas.microsoft.com/office/word/2018/wordml" xmlns:w16du="http://schemas.microsoft.com/office/word/2023/wordml/word16du" xmlns:w16sdtdh="http://schemas.microsoft.com/office/word/2020/wordml/sdtdatahash" xmlns:w16sdtfl="http://schemas.microsoft.com/office/word/2024/wordml/sdtformatlock" xmlns:w16se="http://schemas.microsoft.com/office/word/2015/wordml/symex" mc:Ignorable="w14 w15 w16se w16cid w16 w16cex w16sdtdh w16sdtfl w16du wp14">
+<w:styles xmlns:mc="http://schemas.openxmlformats.org/markup-compatibility/2006" xmlns:r="http://schemas.openxmlformats.org/officeDocument/2006/relationships" xmlns:w="http://schemas.openxmlformats.org/wordprocessingml/2006/main" xmlns:w14="http://schemas.microsoft.com/office/word/2010/wordml" xmlns:w15="http://schemas.microsoft.com/office/word/2012/wordml" xmlns:w16cex="http://schemas.microsoft.com/office/word/2018/wordml/cex" xmlns:w16cid="http://schemas.microsoft.com/office/word/2016/wordml/cid" xmlns:w16="http://schemas.microsoft.com/office/word/2018/wordml" xmlns:w16du="http://schemas.microsoft.com/office/word/2023/wordml/word16du" xmlns:w16sdtdh="http://schemas.microsoft.com/office/word/2020/wordml/sdtdatahash" xmlns:w16sdtfl="http://schemas.microsoft.com/office/word/2024/wordml/sdtformatlock" xmlns:w16se="http://schemas.microsoft.com/office/word/2015/wordml/symex" mc:Ignorable="w14 w15 w16se w16cid w16 w16cex w16sdtdh w16sdtfl w16du">
   <w:docDefaults>
     <w:rPrDefault>
       <w:rPr>
-        <w:rFonts w:asciiTheme="minorHAnsi" w:hAnsiTheme="minorHAnsi" w:eastAsiaTheme="minorHAnsi" w:cstheme="minorBidi"/>
+        <w:rFonts w:asciiTheme="minorHAnsi" w:eastAsiaTheme="minorHAnsi" w:hAnsiTheme="minorHAnsi" w:cstheme="minorBidi"/>
         <w:sz w:val="22"/>
         <w:szCs w:val="22"/>
         <w:lang w:val="fr-FR" w:eastAsia="en-US" w:bidi="ar-SA"/>
@@ -6518,14 +6284,14 @@
   <w:latentStyles w:defLockedState="0" w:defUIPriority="99" w:defSemiHidden="0" w:defUnhideWhenUsed="0" w:defQFormat="0" w:count="376">
     <w:lsdException w:name="Normal" w:uiPriority="0" w:qFormat="1"/>
     <w:lsdException w:name="heading 1" w:uiPriority="9" w:qFormat="1"/>
-    <w:lsdException w:name="heading 2" w:uiPriority="9" w:semiHidden="1" w:unhideWhenUsed="1" w:qFormat="1"/>
-    <w:lsdException w:name="heading 3" w:uiPriority="9" w:semiHidden="1" w:unhideWhenUsed="1" w:qFormat="1"/>
-    <w:lsdException w:name="heading 4" w:uiPriority="9" w:semiHidden="1" w:unhideWhenUsed="1" w:qFormat="1"/>
-    <w:lsdException w:name="heading 5" w:uiPriority="9" w:semiHidden="1" w:unhideWhenUsed="1" w:qFormat="1"/>
-    <w:lsdException w:name="heading 6" w:uiPriority="9" w:semiHidden="1" w:unhideWhenUsed="1" w:qFormat="1"/>
-    <w:lsdException w:name="heading 7" w:uiPriority="9" w:semiHidden="1" w:unhideWhenUsed="1" w:qFormat="1"/>
-    <w:lsdException w:name="heading 8" w:uiPriority="9" w:semiHidden="1" w:unhideWhenUsed="1" w:qFormat="1"/>
-    <w:lsdException w:name="heading 9" w:uiPriority="9" w:semiHidden="1" w:unhideWhenUsed="1" w:qFormat="1"/>
+    <w:lsdException w:name="heading 2" w:semiHidden="1" w:uiPriority="9" w:unhideWhenUsed="1" w:qFormat="1"/>
+    <w:lsdException w:name="heading 3" w:semiHidden="1" w:uiPriority="9" w:unhideWhenUsed="1" w:qFormat="1"/>
+    <w:lsdException w:name="heading 4" w:semiHidden="1" w:uiPriority="9" w:unhideWhenUsed="1" w:qFormat="1"/>
+    <w:lsdException w:name="heading 5" w:semiHidden="1" w:uiPriority="9" w:unhideWhenUsed="1" w:qFormat="1"/>
+    <w:lsdException w:name="heading 6" w:semiHidden="1" w:uiPriority="9" w:unhideWhenUsed="1" w:qFormat="1"/>
+    <w:lsdException w:name="heading 7" w:semiHidden="1" w:uiPriority="9" w:unhideWhenUsed="1" w:qFormat="1"/>
+    <w:lsdException w:name="heading 8" w:semiHidden="1" w:uiPriority="9" w:unhideWhenUsed="1" w:qFormat="1"/>
+    <w:lsdException w:name="heading 9" w:semiHidden="1" w:uiPriority="9" w:unhideWhenUsed="1" w:qFormat="1"/>
     <w:lsdException w:name="index 1" w:semiHidden="1" w:unhideWhenUsed="1"/>
     <w:lsdException w:name="index 2" w:semiHidden="1" w:unhideWhenUsed="1"/>
     <w:lsdException w:name="index 3" w:semiHidden="1" w:unhideWhenUsed="1"/>
@@ -6535,22 +6301,22 @@
     <w:lsdException w:name="index 7" w:semiHidden="1" w:unhideWhenUsed="1"/>
     <w:lsdException w:name="index 8" w:semiHidden="1" w:unhideWhenUsed="1"/>
     <w:lsdException w:name="index 9" w:semiHidden="1" w:unhideWhenUsed="1"/>
-    <w:lsdException w:name="toc 1" w:uiPriority="39" w:semiHidden="1" w:unhideWhenUsed="1"/>
-    <w:lsdException w:name="toc 2" w:uiPriority="39" w:semiHidden="1" w:unhideWhenUsed="1"/>
-    <w:lsdException w:name="toc 3" w:uiPriority="39" w:semiHidden="1" w:unhideWhenUsed="1"/>
-    <w:lsdException w:name="toc 4" w:uiPriority="39" w:semiHidden="1" w:unhideWhenUsed="1"/>
-    <w:lsdException w:name="toc 5" w:uiPriority="39" w:semiHidden="1" w:unhideWhenUsed="1"/>
-    <w:lsdException w:name="toc 6" w:uiPriority="39" w:semiHidden="1" w:unhideWhenUsed="1"/>
-    <w:lsdException w:name="toc 7" w:uiPriority="39" w:semiHidden="1" w:unhideWhenUsed="1"/>
-    <w:lsdException w:name="toc 8" w:uiPriority="39" w:semiHidden="1" w:unhideWhenUsed="1"/>
-    <w:lsdException w:name="toc 9" w:uiPriority="39" w:semiHidden="1" w:unhideWhenUsed="1"/>
+    <w:lsdException w:name="toc 1" w:semiHidden="1" w:uiPriority="39" w:unhideWhenUsed="1"/>
+    <w:lsdException w:name="toc 2" w:semiHidden="1" w:uiPriority="39" w:unhideWhenUsed="1"/>
+    <w:lsdException w:name="toc 3" w:semiHidden="1" w:uiPriority="39" w:unhideWhenUsed="1"/>
+    <w:lsdException w:name="toc 4" w:semiHidden="1" w:uiPriority="39" w:unhideWhenUsed="1"/>
+    <w:lsdException w:name="toc 5" w:semiHidden="1" w:uiPriority="39" w:unhideWhenUsed="1"/>
+    <w:lsdException w:name="toc 6" w:semiHidden="1" w:uiPriority="39" w:unhideWhenUsed="1"/>
+    <w:lsdException w:name="toc 7" w:semiHidden="1" w:uiPriority="39" w:unhideWhenUsed="1"/>
+    <w:lsdException w:name="toc 8" w:semiHidden="1" w:uiPriority="39" w:unhideWhenUsed="1"/>
+    <w:lsdException w:name="toc 9" w:semiHidden="1" w:uiPriority="39" w:unhideWhenUsed="1"/>
     <w:lsdException w:name="Normal Indent" w:semiHidden="1" w:unhideWhenUsed="1"/>
     <w:lsdException w:name="footnote text" w:semiHidden="1" w:unhideWhenUsed="1"/>
     <w:lsdException w:name="annotation text" w:semiHidden="1" w:unhideWhenUsed="1"/>
     <w:lsdException w:name="header" w:semiHidden="1" w:unhideWhenUsed="1"/>
     <w:lsdException w:name="footer" w:semiHidden="1" w:unhideWhenUsed="1"/>
     <w:lsdException w:name="index heading" w:semiHidden="1" w:unhideWhenUsed="1"/>
-    <w:lsdException w:name="caption" w:uiPriority="35" w:semiHidden="1" w:unhideWhenUsed="1" w:qFormat="1"/>
+    <w:lsdException w:name="caption" w:semiHidden="1" w:uiPriority="35" w:unhideWhenUsed="1" w:qFormat="1"/>
     <w:lsdException w:name="table of figures" w:semiHidden="1" w:unhideWhenUsed="1"/>
     <w:lsdException w:name="envelope address" w:semiHidden="1" w:unhideWhenUsed="1"/>
     <w:lsdException w:name="envelope return" w:semiHidden="1" w:unhideWhenUsed="1"/>
@@ -6581,7 +6347,7 @@
     <w:lsdException w:name="Title" w:uiPriority="10" w:qFormat="1"/>
     <w:lsdException w:name="Closing" w:semiHidden="1" w:unhideWhenUsed="1"/>
     <w:lsdException w:name="Signature" w:semiHidden="1" w:unhideWhenUsed="1"/>
-    <w:lsdException w:name="Default Paragraph Font" w:uiPriority="1" w:semiHidden="1" w:unhideWhenUsed="1"/>
+    <w:lsdException w:name="Default Paragraph Font" w:semiHidden="1" w:uiPriority="1" w:unhideWhenUsed="1"/>
     <w:lsdException w:name="Body Text" w:semiHidden="1" w:unhideWhenUsed="1"/>
     <w:lsdException w:name="Body Text Indent" w:semiHidden="1" w:unhideWhenUsed="1"/>
     <w:lsdException w:name="List Continue" w:semiHidden="1" w:unhideWhenUsed="1"/>
@@ -6781,8 +6547,8 @@
     <w:lsdException w:name="Subtle Reference" w:uiPriority="31" w:qFormat="1"/>
     <w:lsdException w:name="Intense Reference" w:uiPriority="32" w:qFormat="1"/>
     <w:lsdException w:name="Book Title" w:uiPriority="33" w:qFormat="1"/>
-    <w:lsdException w:name="Bibliography" w:uiPriority="37" w:semiHidden="1" w:unhideWhenUsed="1"/>
-    <w:lsdException w:name="TOC Heading" w:uiPriority="39" w:semiHidden="1" w:unhideWhenUsed="1" w:qFormat="1"/>
+    <w:lsdException w:name="Bibliography" w:semiHidden="1" w:uiPriority="37" w:unhideWhenUsed="1"/>
+    <w:lsdException w:name="TOC Heading" w:semiHidden="1" w:uiPriority="39" w:unhideWhenUsed="1" w:qFormat="1"/>
     <w:lsdException w:name="Plain Table 1" w:uiPriority="41"/>
     <w:lsdException w:name="Plain Table 2" w:uiPriority="42"/>
     <w:lsdException w:name="Plain Table 3" w:uiPriority="43"/>
@@ -6893,7 +6659,7 @@
     <w:lsdException w:name="Unresolved Mention" w:semiHidden="1" w:unhideWhenUsed="1"/>
     <w:lsdException w:name="Smart Link" w:semiHidden="1" w:unhideWhenUsed="1"/>
   </w:latentStyles>
-  <w:style w:type="paragraph" w:styleId="Normal" w:default="1">
+  <w:style w:type="paragraph" w:default="1" w:styleId="Normal">
     <w:name w:val="Normal"/>
     <w:qFormat/>
   </w:style>
@@ -6915,7 +6681,7 @@
       <w:outlineLvl w:val="0"/>
     </w:pPr>
     <w:rPr>
-      <w:rFonts w:asciiTheme="majorHAnsi" w:hAnsiTheme="majorHAnsi" w:eastAsiaTheme="majorEastAsia" w:cstheme="majorBidi"/>
+      <w:rFonts w:asciiTheme="majorHAnsi" w:eastAsiaTheme="majorEastAsia" w:hAnsiTheme="majorHAnsi" w:cstheme="majorBidi"/>
       <w:color w:val="0F4761" w:themeColor="accent1" w:themeShade="BF"/>
       <w:sz w:val="40"/>
       <w:szCs w:val="40"/>
@@ -6941,7 +6707,7 @@
       <w:outlineLvl w:val="1"/>
     </w:pPr>
     <w:rPr>
-      <w:rFonts w:asciiTheme="majorHAnsi" w:hAnsiTheme="majorHAnsi" w:eastAsiaTheme="majorEastAsia" w:cstheme="majorBidi"/>
+      <w:rFonts w:asciiTheme="majorHAnsi" w:eastAsiaTheme="majorEastAsia" w:hAnsiTheme="majorHAnsi" w:cstheme="majorBidi"/>
       <w:color w:val="0F4761" w:themeColor="accent1" w:themeShade="BF"/>
       <w:sz w:val="32"/>
       <w:szCs w:val="32"/>
@@ -7129,12 +6895,13 @@
       <w:color w:val="272727" w:themeColor="text1" w:themeTint="D8"/>
     </w:rPr>
   </w:style>
-  <w:style w:type="character" w:styleId="Policepardfaut" w:default="1">
+  <w:style w:type="character" w:default="1" w:styleId="Policepardfaut">
     <w:name w:val="Default Paragraph Font"/>
     <w:uiPriority w:val="1"/>
+    <w:semiHidden/>
     <w:unhideWhenUsed/>
   </w:style>
-  <w:style w:type="table" w:styleId="TableauNormal" w:default="1">
+  <w:style w:type="table" w:default="1" w:styleId="TableauNormal">
     <w:name w:val="Normal Table"/>
     <w:uiPriority w:val="99"/>
     <w:semiHidden/>
@@ -7149,39 +6916,39 @@
       </w:tblCellMar>
     </w:tblPr>
   </w:style>
-  <w:style w:type="numbering" w:styleId="Aucuneliste" w:default="1">
+  <w:style w:type="numbering" w:default="1" w:styleId="Aucuneliste">
     <w:name w:val="No List"/>
     <w:uiPriority w:val="99"/>
     <w:semiHidden/>
     <w:unhideWhenUsed/>
   </w:style>
-  <w:style w:type="character" w:styleId="Titre1Car" w:customStyle="1">
+  <w:style w:type="character" w:customStyle="1" w:styleId="Titre1Car">
     <w:name w:val="Titre 1 Car"/>
     <w:basedOn w:val="Policepardfaut"/>
     <w:link w:val="Titre1"/>
     <w:uiPriority w:val="9"/>
     <w:rsid w:val="00082A10"/>
     <w:rPr>
-      <w:rFonts w:asciiTheme="majorHAnsi" w:hAnsiTheme="majorHAnsi" w:eastAsiaTheme="majorEastAsia" w:cstheme="majorBidi"/>
+      <w:rFonts w:asciiTheme="majorHAnsi" w:eastAsiaTheme="majorEastAsia" w:hAnsiTheme="majorHAnsi" w:cstheme="majorBidi"/>
       <w:color w:val="0F4761" w:themeColor="accent1" w:themeShade="BF"/>
       <w:sz w:val="40"/>
       <w:szCs w:val="40"/>
     </w:rPr>
   </w:style>
-  <w:style w:type="character" w:styleId="Titre2Car" w:customStyle="1">
+  <w:style w:type="character" w:customStyle="1" w:styleId="Titre2Car">
     <w:name w:val="Titre 2 Car"/>
     <w:basedOn w:val="Policepardfaut"/>
     <w:link w:val="Titre2"/>
     <w:uiPriority w:val="9"/>
     <w:rsid w:val="00082A10"/>
     <w:rPr>
-      <w:rFonts w:asciiTheme="majorHAnsi" w:hAnsiTheme="majorHAnsi" w:eastAsiaTheme="majorEastAsia" w:cstheme="majorBidi"/>
+      <w:rFonts w:asciiTheme="majorHAnsi" w:eastAsiaTheme="majorEastAsia" w:hAnsiTheme="majorHAnsi" w:cstheme="majorBidi"/>
       <w:color w:val="0F4761" w:themeColor="accent1" w:themeShade="BF"/>
       <w:sz w:val="32"/>
       <w:szCs w:val="32"/>
     </w:rPr>
   </w:style>
-  <w:style w:type="character" w:styleId="Titre3Car" w:customStyle="1">
+  <w:style w:type="character" w:customStyle="1" w:styleId="Titre3Car">
     <w:name w:val="Titre 3 Car"/>
     <w:basedOn w:val="Policepardfaut"/>
     <w:link w:val="Titre3"/>
@@ -7194,7 +6961,7 @@
       <w:szCs w:val="28"/>
     </w:rPr>
   </w:style>
-  <w:style w:type="character" w:styleId="Titre4Car" w:customStyle="1">
+  <w:style w:type="character" w:customStyle="1" w:styleId="Titre4Car">
     <w:name w:val="Titre 4 Car"/>
     <w:basedOn w:val="Policepardfaut"/>
     <w:link w:val="Titre4"/>
@@ -7208,7 +6975,7 @@
       <w:color w:val="0F4761" w:themeColor="accent1" w:themeShade="BF"/>
     </w:rPr>
   </w:style>
-  <w:style w:type="character" w:styleId="Titre5Car" w:customStyle="1">
+  <w:style w:type="character" w:customStyle="1" w:styleId="Titre5Car">
     <w:name w:val="Titre 5 Car"/>
     <w:basedOn w:val="Policepardfaut"/>
     <w:link w:val="Titre5"/>
@@ -7220,7 +6987,7 @@
       <w:color w:val="0F4761" w:themeColor="accent1" w:themeShade="BF"/>
     </w:rPr>
   </w:style>
-  <w:style w:type="character" w:styleId="Titre6Car" w:customStyle="1">
+  <w:style w:type="character" w:customStyle="1" w:styleId="Titre6Car">
     <w:name w:val="Titre 6 Car"/>
     <w:basedOn w:val="Policepardfaut"/>
     <w:link w:val="Titre6"/>
@@ -7234,7 +7001,7 @@
       <w:color w:val="595959" w:themeColor="text1" w:themeTint="A6"/>
     </w:rPr>
   </w:style>
-  <w:style w:type="character" w:styleId="Titre7Car" w:customStyle="1">
+  <w:style w:type="character" w:customStyle="1" w:styleId="Titre7Car">
     <w:name w:val="Titre 7 Car"/>
     <w:basedOn w:val="Policepardfaut"/>
     <w:link w:val="Titre7"/>
@@ -7246,7 +7013,7 @@
       <w:color w:val="595959" w:themeColor="text1" w:themeTint="A6"/>
     </w:rPr>
   </w:style>
-  <w:style w:type="character" w:styleId="Titre8Car" w:customStyle="1">
+  <w:style w:type="character" w:customStyle="1" w:styleId="Titre8Car">
     <w:name w:val="Titre 8 Car"/>
     <w:basedOn w:val="Policepardfaut"/>
     <w:link w:val="Titre8"/>
@@ -7260,7 +7027,7 @@
       <w:color w:val="272727" w:themeColor="text1" w:themeTint="D8"/>
     </w:rPr>
   </w:style>
-  <w:style w:type="character" w:styleId="Titre9Car" w:customStyle="1">
+  <w:style w:type="character" w:customStyle="1" w:styleId="Titre9Car">
     <w:name w:val="Titre 9 Car"/>
     <w:basedOn w:val="Policepardfaut"/>
     <w:link w:val="Titre9"/>
@@ -7285,21 +7052,21 @@
       <w:contextualSpacing/>
     </w:pPr>
     <w:rPr>
-      <w:rFonts w:asciiTheme="majorHAnsi" w:hAnsiTheme="majorHAnsi" w:eastAsiaTheme="majorEastAsia" w:cstheme="majorBidi"/>
+      <w:rFonts w:asciiTheme="majorHAnsi" w:eastAsiaTheme="majorEastAsia" w:hAnsiTheme="majorHAnsi" w:cstheme="majorBidi"/>
       <w:spacing w:val="-10"/>
       <w:kern w:val="28"/>
       <w:sz w:val="56"/>
       <w:szCs w:val="56"/>
     </w:rPr>
   </w:style>
-  <w:style w:type="character" w:styleId="TitreCar" w:customStyle="1">
+  <w:style w:type="character" w:customStyle="1" w:styleId="TitreCar">
     <w:name w:val="Titre Car"/>
     <w:basedOn w:val="Policepardfaut"/>
     <w:link w:val="Titre"/>
     <w:uiPriority w:val="10"/>
     <w:rsid w:val="00082A10"/>
     <w:rPr>
-      <w:rFonts w:asciiTheme="majorHAnsi" w:hAnsiTheme="majorHAnsi" w:eastAsiaTheme="majorEastAsia" w:cstheme="majorBidi"/>
+      <w:rFonts w:asciiTheme="majorHAnsi" w:eastAsiaTheme="majorEastAsia" w:hAnsiTheme="majorHAnsi" w:cstheme="majorBidi"/>
       <w:spacing w:val="-10"/>
       <w:kern w:val="28"/>
       <w:sz w:val="56"/>
@@ -7327,7 +7094,7 @@
       <w:szCs w:val="28"/>
     </w:rPr>
   </w:style>
-  <w:style w:type="character" w:styleId="Sous-titreCar" w:customStyle="1">
+  <w:style w:type="character" w:customStyle="1" w:styleId="Sous-titreCar">
     <w:name w:val="Sous-titre Car"/>
     <w:basedOn w:val="Policepardfaut"/>
     <w:link w:val="Sous-titre"/>
@@ -7359,7 +7126,7 @@
       <w:color w:val="404040" w:themeColor="text1" w:themeTint="BF"/>
     </w:rPr>
   </w:style>
-  <w:style w:type="character" w:styleId="CitationCar" w:customStyle="1">
+  <w:style w:type="character" w:customStyle="1" w:styleId="CitationCar">
     <w:name w:val="Citation Car"/>
     <w:basedOn w:val="Policepardfaut"/>
     <w:link w:val="Citation"/>
@@ -7404,8 +7171,8 @@
     <w:rsid w:val="00082A10"/>
     <w:pPr>
       <w:pBdr>
-        <w:top w:val="single" w:color="0F4761" w:themeColor="accent1" w:themeShade="BF" w:sz="4" w:space="10"/>
-        <w:bottom w:val="single" w:color="0F4761" w:themeColor="accent1" w:themeShade="BF" w:sz="4" w:space="10"/>
+        <w:top w:val="single" w:sz="4" w:space="10" w:color="0F4761" w:themeColor="accent1" w:themeShade="BF"/>
+        <w:bottom w:val="single" w:sz="4" w:space="10" w:color="0F4761" w:themeColor="accent1" w:themeShade="BF"/>
       </w:pBdr>
       <w:spacing w:before="360" w:after="360"/>
       <w:ind w:left="864" w:right="864"/>
@@ -7417,7 +7184,7 @@
       <w:color w:val="0F4761" w:themeColor="accent1" w:themeShade="BF"/>
     </w:rPr>
   </w:style>
-  <w:style w:type="character" w:styleId="CitationintenseCar" w:customStyle="1">
+  <w:style w:type="character" w:customStyle="1" w:styleId="CitationintenseCar">
     <w:name w:val="Citation intense Car"/>
     <w:basedOn w:val="Policepardfaut"/>
     <w:link w:val="Citationintense"/>
@@ -7458,7 +7225,7 @@
       <w:spacing w:after="0" w:line="240" w:lineRule="auto"/>
     </w:pPr>
   </w:style>
-  <w:style w:type="character" w:styleId="En-tteCar" w:customStyle="1">
+  <w:style w:type="character" w:customStyle="1" w:styleId="En-tteCar">
     <w:name w:val="En-tête Car"/>
     <w:basedOn w:val="Policepardfaut"/>
     <w:link w:val="En-tte"/>
@@ -7480,7 +7247,7 @@
       <w:spacing w:after="0" w:line="240" w:lineRule="auto"/>
     </w:pPr>
   </w:style>
-  <w:style w:type="character" w:styleId="PieddepageCar" w:customStyle="1">
+  <w:style w:type="character" w:customStyle="1" w:styleId="PieddepageCar">
     <w:name w:val="Pied de page Car"/>
     <w:basedOn w:val="Policepardfaut"/>
     <w:link w:val="Pieddepage"/>
@@ -7527,7 +7294,7 @@
 </file>
 
 <file path=word/theme/theme1.xml><?xml version="1.0" encoding="utf-8"?>
-<a:theme xmlns:a="http://schemas.openxmlformats.org/drawingml/2006/main" xmlns:thm15="http://schemas.microsoft.com/office/thememl/2012/main" name="Thème Office">
+<a:theme xmlns:a="http://schemas.openxmlformats.org/drawingml/2006/main" name="Thème Office">
   <a:themeElements>
     <a:clrScheme name="Office">
       <a:dk1>

</xml_diff>